<commit_message>
docs(report): 重生成 design_report.docx（加入全流程 overlay 与场景分层测试集）
Co-Authored-By: Claude Code <noreply@anthropic.com>
</commit_message>
<xml_diff>
--- a/report/design_report.docx
+++ b/report/design_report.docx
@@ -6961,7 +6961,15 @@
                 <w:b w:val="0"/>
                 <w:sz w:val="18"/>
               </w:rPr>
-              <w:t>—</w:t>
+              <w:t xml:space="preserve">❌ </w:t>
+            </w:r>
+            <w:r>
+              <w:rPr>
+                <w:rFonts w:ascii="微软雅黑" w:hAnsi="微软雅黑" w:eastAsia="微软雅黑"/>
+                <w:b/>
+                <w:sz w:val="18"/>
+              </w:rPr>
+              <w:t>全白</w:t>
             </w:r>
           </w:p>
         </w:tc>
@@ -6977,13 +6985,89 @@
                 <w:b w:val="0"/>
                 <w:sz w:val="18"/>
               </w:rPr>
-              <w:t xml:space="preserve">彩条 + 移动白块的 </w:t>
+              <w:t xml:space="preserve">2026-10-30 复验时屏上纯白、无画面 —— 而 </w:t>
             </w:r>
             <w:r>
               <w:rPr>
                 <w:rFonts w:ascii="Consolas" w:hAnsi="Consolas" w:eastAsia="Consolas"/>
                 <w:sz w:val="17"/>
               </w:rPr>
+              <w:t>frames</w:t>
+            </w:r>
+            <w:r>
+              <w:rPr>
+                <w:rFonts w:ascii="微软雅黑" w:hAnsi="微软雅黑" w:eastAsia="微软雅黑"/>
+                <w:b w:val="0"/>
+                <w:sz w:val="18"/>
+              </w:rPr>
+              <w:t xml:space="preserve"> 仍 60/s 增长、</w:t>
+            </w:r>
+            <w:r>
+              <w:rPr>
+                <w:rFonts w:ascii="Consolas" w:hAnsi="Consolas" w:eastAsia="Consolas"/>
+                <w:sz w:val="17"/>
+              </w:rPr>
+              <w:t>under=0</w:t>
+            </w:r>
+            <w:r>
+              <w:rPr>
+                <w:rFonts w:ascii="微软雅黑" w:hAnsi="微软雅黑" w:eastAsia="微软雅黑"/>
+                <w:b w:val="0"/>
+                <w:sz w:val="18"/>
+              </w:rPr>
+              <w:t xml:space="preserve">、帧缓存地址与 </w:t>
+            </w:r>
+            <w:r>
+              <w:rPr>
+                <w:rFonts w:ascii="Consolas" w:hAnsi="Consolas" w:eastAsia="Consolas"/>
+                <w:sz w:val="17"/>
+              </w:rPr>
+              <w:t>pack</w:t>
+            </w:r>
+            <w:r>
+              <w:rPr>
+                <w:rFonts w:ascii="微软雅黑" w:hAnsi="微软雅黑" w:eastAsia="微软雅黑"/>
+                <w:b w:val="0"/>
+                <w:sz w:val="18"/>
+              </w:rPr>
+              <w:t xml:space="preserve"> 解出来全对。</w:t>
+            </w:r>
+            <w:r>
+              <w:rPr>
+                <w:rFonts w:ascii="微软雅黑" w:hAnsi="微软雅黑" w:eastAsia="微软雅黑"/>
+                <w:b/>
+                <w:sz w:val="18"/>
+              </w:rPr>
+              <w:t>机器判据全过、画面是白的</w:t>
+            </w:r>
+            <w:r>
+              <w:rPr>
+                <w:rFonts w:ascii="微软雅黑" w:hAnsi="微软雅黑" w:eastAsia="微软雅黑"/>
+                <w:b w:val="0"/>
+                <w:sz w:val="18"/>
+              </w:rPr>
+              <w:t>，这是「</w:t>
+            </w:r>
+            <w:r>
+              <w:rPr>
+                <w:rFonts w:ascii="Consolas" w:hAnsi="Consolas" w:eastAsia="Consolas"/>
+                <w:sz w:val="17"/>
+              </w:rPr>
+              <w:t>BRAM_OK</w:t>
+            </w:r>
+            <w:r>
+              <w:rPr>
+                <w:rFonts w:ascii="微软雅黑" w:hAnsi="微软雅黑" w:eastAsia="微软雅黑"/>
+                <w:b w:val="0"/>
+                <w:sz w:val="18"/>
+              </w:rPr>
+              <w:t xml:space="preserve"> 不能替代 </w:t>
+            </w:r>
+            <w:r>
+              <w:rPr>
+                <w:rFonts w:ascii="Consolas" w:hAnsi="Consolas" w:eastAsia="Consolas"/>
+                <w:sz w:val="17"/>
+              </w:rPr>
               <w:t>VISUAL_OK</w:t>
             </w:r>
             <w:r>
@@ -6992,7 +7076,116 @@
                 <w:b w:val="0"/>
                 <w:sz w:val="18"/>
               </w:rPr>
-              <w:t xml:space="preserve"> </w:t>
+              <w:t>」最直接的一次实例</w:t>
+            </w:r>
+          </w:p>
+        </w:tc>
+      </w:tr>
+      <w:tr>
+        <w:tc>
+          <w:tcPr>
+            <w:tcW w:type="dxa" w:w="2880"/>
+          </w:tcPr>
+          <w:p>
+            <w:r/>
+            <w:r>
+              <w:rPr>
+                <w:rFonts w:ascii="微软雅黑" w:hAnsi="微软雅黑" w:eastAsia="微软雅黑"/>
+                <w:b w:val="0"/>
+                <w:sz w:val="18"/>
+              </w:rPr>
+              <w:t>归因与修复</w:t>
+            </w:r>
+          </w:p>
+        </w:tc>
+        <w:tc>
+          <w:tcPr>
+            <w:tcW w:type="dxa" w:w="2880"/>
+          </w:tcPr>
+          <w:p>
+            <w:r/>
+            <w:r>
+              <w:rPr>
+                <w:rFonts w:ascii="Consolas" w:hAnsi="Consolas" w:eastAsia="Consolas"/>
+                <w:sz w:val="17"/>
+              </w:rPr>
+              <w:t>cacheable=True</w:t>
+            </w:r>
+          </w:p>
+        </w:tc>
+        <w:tc>
+          <w:tcPr>
+            <w:tcW w:type="dxa" w:w="2880"/>
+          </w:tcPr>
+          <w:p>
+            <w:r/>
+            <w:r>
+              <w:rPr>
+                <w:rFonts w:ascii="微软雅黑" w:hAnsi="微软雅黑" w:eastAsia="微软雅黑"/>
+                <w:b w:val="0"/>
+                <w:sz w:val="18"/>
+              </w:rPr>
+              <w:t xml:space="preserve">实测 </w:t>
+            </w:r>
+            <w:r>
+              <w:rPr>
+                <w:rFonts w:ascii="Consolas" w:hAnsi="Consolas" w:eastAsia="Consolas"/>
+                <w:sz w:val="17"/>
+              </w:rPr>
+              <w:t>allocate()</w:t>
+            </w:r>
+            <w:r>
+              <w:rPr>
+                <w:rFonts w:ascii="微软雅黑" w:hAnsi="微软雅黑" w:eastAsia="微软雅黑"/>
+                <w:b w:val="0"/>
+                <w:sz w:val="18"/>
+              </w:rPr>
+              <w:t xml:space="preserve"> 出来的帧缓存 </w:t>
+            </w:r>
+            <w:r>
+              <w:rPr>
+                <w:rFonts w:ascii="Consolas" w:hAnsi="Consolas" w:eastAsia="Consolas"/>
+                <w:sz w:val="17"/>
+              </w:rPr>
+              <w:t>cacheable=True</w:t>
+            </w:r>
+            <w:r>
+              <w:rPr>
+                <w:rFonts w:ascii="微软雅黑" w:hAnsi="微软雅黑" w:eastAsia="微软雅黑"/>
+                <w:b w:val="0"/>
+                <w:sz w:val="18"/>
+              </w:rPr>
+              <w:t xml:space="preserve">：CPU 写完只在 cache 里，PL 走 HP0 直接读 DDR ⇒ 读到旧内容。已在 </w:t>
+            </w:r>
+            <w:r>
+              <w:rPr>
+                <w:rFonts w:ascii="Consolas" w:hAnsi="Consolas" w:eastAsia="Consolas"/>
+                <w:sz w:val="17"/>
+              </w:rPr>
+              <w:t>HdmiVideoOut.show()</w:t>
+            </w:r>
+            <w:r>
+              <w:rPr>
+                <w:rFonts w:ascii="微软雅黑" w:hAnsi="微软雅黑" w:eastAsia="微软雅黑"/>
+                <w:b w:val="0"/>
+                <w:sz w:val="18"/>
+              </w:rPr>
+              <w:t xml:space="preserve"> 里于切基址前加 </w:t>
+            </w:r>
+            <w:r>
+              <w:rPr>
+                <w:rFonts w:ascii="Consolas" w:hAnsi="Consolas" w:eastAsia="Consolas"/>
+                <w:sz w:val="17"/>
+              </w:rPr>
+              <w:t>Buffer.flush()</w:t>
+            </w:r>
+            <w:r>
+              <w:rPr>
+                <w:rFonts w:ascii="微软雅黑" w:hAnsi="微软雅黑" w:eastAsia="微软雅黑"/>
+                <w:b w:val="0"/>
+                <w:sz w:val="18"/>
+              </w:rPr>
+              <w:t>；</w:t>
             </w:r>
             <w:r>
               <w:rPr>
@@ -7000,15 +7193,15 @@
                 <w:b/>
                 <w:sz w:val="18"/>
               </w:rPr>
-              <w:t>尚未确认</w:t>
-            </w:r>
-            <w:r>
-              <w:rPr>
-                <w:rFonts w:ascii="微软雅黑" w:hAnsi="微软雅黑" w:eastAsia="微软雅黑"/>
-                <w:b w:val="0"/>
-                <w:sz w:val="18"/>
-              </w:rPr>
-              <w:t>；带框图在真屏上尚未看过</w:t>
+              <w:t>修复已上板但画面尚未复验</w:t>
+            </w:r>
+            <w:r>
+              <w:rPr>
+                <w:rFonts w:ascii="微软雅黑" w:hAnsi="微软雅黑" w:eastAsia="微软雅黑"/>
+                <w:b w:val="0"/>
+                <w:sz w:val="18"/>
+              </w:rPr>
+              <w:t>，不得据此宣称 HDMI 已通</w:t>
             </w:r>
           </w:p>
         </w:tc>
@@ -7200,6 +7393,1629 @@
           <w:sz w:val="21"/>
         </w:rPr>
         <w:t>「检测器给的框是对的」。真实框要跑真管线 JSONL 才谈得上。</w:t>
+      </w:r>
+    </w:p>
+    <w:p>
+      <w:pPr>
+        <w:pStyle w:val="Heading2"/>
+      </w:pPr>
+      <w:r>
+        <w:rPr>
+          <w:rFonts w:ascii="微软雅黑" w:hAnsi="微软雅黑" w:eastAsia="微软雅黑"/>
+          <w:b/>
+          <w:sz w:val="25"/>
+        </w:rPr>
+        <w:t>2.11 全流程固化 overlay 与分层测试集（2026-10-30）</w:t>
+      </w:r>
+    </w:p>
+    <w:p>
+      <w:pPr>
+        <w:spacing w:after="120"/>
+        <w:ind w:firstLine="0"/>
+      </w:pPr>
+      <w:r>
+        <w:rPr>
+          <w:rFonts w:ascii="微软雅黑" w:hAnsi="微软雅黑" w:eastAsia="微软雅黑"/>
+          <w:b/>
+          <w:sz w:val="21"/>
+        </w:rPr>
+        <w:t>为什么要把 bitstream 合并</w:t>
+      </w:r>
+      <w:r>
+        <w:rPr>
+          <w:rFonts w:ascii="微软雅黑" w:hAnsi="微软雅黑" w:eastAsia="微软雅黑"/>
+          <w:b w:val="0"/>
+          <w:sz w:val="21"/>
+        </w:rPr>
+        <w:t>：在此之前，面板（</w:t>
+      </w:r>
+      <w:r>
+        <w:rPr>
+          <w:rFonts w:ascii="Consolas" w:hAnsi="Consolas" w:eastAsia="Consolas"/>
+          <w:sz w:val="20"/>
+        </w:rPr>
+        <w:t>lcd_probe.bit</w:t>
+      </w:r>
+      <w:r>
+        <w:rPr>
+          <w:rFonts w:ascii="微软雅黑" w:hAnsi="微软雅黑" w:eastAsia="微软雅黑"/>
+          <w:b w:val="0"/>
+          <w:sz w:val="21"/>
+        </w:rPr>
+        <w:t>）、带框大屏（</w:t>
+      </w:r>
+      <w:r>
+        <w:rPr>
+          <w:rFonts w:ascii="Consolas" w:hAnsi="Consolas" w:eastAsia="Consolas"/>
+          <w:sz w:val="20"/>
+        </w:rPr>
+        <w:t>hdmi_video.bit</w:t>
+      </w:r>
+      <w:r>
+        <w:rPr>
+          <w:rFonts w:ascii="微软雅黑" w:hAnsi="微软雅黑" w:eastAsia="微软雅黑"/>
+          <w:b w:val="0"/>
+          <w:sz w:val="21"/>
+        </w:rPr>
+        <w:t xml:space="preserve">） 是两个比特流，换一项功能就要重新 </w:t>
+      </w:r>
+      <w:r>
+        <w:rPr>
+          <w:rFonts w:ascii="Consolas" w:hAnsi="Consolas" w:eastAsia="Consolas"/>
+          <w:sz w:val="20"/>
+        </w:rPr>
+        <w:t>Overlay()</w:t>
+      </w:r>
+      <w:r>
+        <w:rPr>
+          <w:rFonts w:ascii="微软雅黑" w:hAnsi="微软雅黑" w:eastAsia="微软雅黑"/>
+          <w:b w:val="0"/>
+          <w:sz w:val="21"/>
+        </w:rPr>
+        <w:t xml:space="preserve"> 加载、PS 侧所有句柄重建。 赛场上「先看小屏面板、再看大屏回放」不该意味着一次中断。</w:t>
+      </w:r>
+      <w:r>
+        <w:rPr>
+          <w:rFonts w:ascii="Consolas" w:hAnsi="Consolas" w:eastAsia="Consolas"/>
+          <w:sz w:val="20"/>
+        </w:rPr>
+        <w:t>flow_system.bit</w:t>
+      </w:r>
+      <w:r>
+        <w:rPr>
+          <w:rFonts w:ascii="微软雅黑" w:hAnsi="微软雅黑" w:eastAsia="微软雅黑"/>
+          <w:b w:val="0"/>
+          <w:sz w:val="21"/>
+        </w:rPr>
+        <w:t xml:space="preserve"> 把 </w:t>
+      </w:r>
+      <w:r>
+        <w:rPr>
+          <w:rFonts w:ascii="微软雅黑" w:hAnsi="微软雅黑" w:eastAsia="微软雅黑"/>
+          <w:b/>
+          <w:sz w:val="21"/>
+        </w:rPr>
+        <w:t>LCD 4bpp 帧缓存 + 两颗按键 + HDMI 32bpp 扫描输出</w:t>
+      </w:r>
+      <w:r>
+        <w:rPr>
+          <w:rFonts w:ascii="微软雅黑" w:hAnsi="微软雅黑" w:eastAsia="微软雅黑"/>
+          <w:b w:val="0"/>
+          <w:sz w:val="21"/>
+        </w:rPr>
+        <w:t>放进同一个 PL 配置。</w:t>
+      </w:r>
+    </w:p>
+    <w:p>
+      <w:pPr>
+        <w:spacing w:after="120"/>
+        <w:ind w:firstLine="0"/>
+      </w:pPr>
+      <w:r>
+        <w:rPr>
+          <w:rFonts w:ascii="微软雅黑" w:hAnsi="微软雅黑" w:eastAsia="微软雅黑"/>
+          <w:b/>
+          <w:sz w:val="21"/>
+        </w:rPr>
+        <w:t>怎么合</w:t>
+      </w:r>
+      <w:r>
+        <w:rPr>
+          <w:rFonts w:ascii="微软雅黑" w:hAnsi="微软雅黑" w:eastAsia="微软雅黑"/>
+          <w:b w:val="0"/>
+          <w:sz w:val="21"/>
+        </w:rPr>
+        <w:t>（</w:t>
+      </w:r>
+      <w:r>
+        <w:rPr>
+          <w:rFonts w:ascii="Consolas" w:hAnsi="Consolas" w:eastAsia="Consolas"/>
+          <w:sz w:val="20"/>
+        </w:rPr>
+        <w:t>build/scripts/bd_flow_system.tcl</w:t>
+      </w:r>
+      <w:r>
+        <w:rPr>
+          <w:rFonts w:ascii="微软雅黑" w:hAnsi="微软雅黑" w:eastAsia="微软雅黑"/>
+          <w:b w:val="0"/>
+          <w:sz w:val="21"/>
+        </w:rPr>
+        <w:t>）：</w:t>
+      </w:r>
+    </w:p>
+    <w:tbl>
+      <w:tblPr>
+        <w:tblStyle w:val="TableGrid"/>
+        <w:tblW w:type="auto" w:w="0"/>
+        <w:jc w:val="center"/>
+        <w:tblLook w:firstColumn="1" w:firstRow="1" w:lastColumn="0" w:lastRow="0" w:noHBand="0" w:noVBand="1" w:val="04A0"/>
+      </w:tblPr>
+      <w:tblGrid>
+        <w:gridCol w:w="2880"/>
+        <w:gridCol w:w="2880"/>
+        <w:gridCol w:w="2880"/>
+      </w:tblGrid>
+      <w:tr>
+        <w:tc>
+          <w:tcPr>
+            <w:tcW w:type="dxa" w:w="2880"/>
+            <w:shd w:val="clear" w:color="auto" w:fill="E8EEF7"/>
+          </w:tcPr>
+          <w:p>
+            <w:r>
+              <w:rPr>
+                <w:b/>
+              </w:rPr>
+            </w:r>
+            <w:r>
+              <w:rPr>
+                <w:rFonts w:ascii="微软雅黑" w:hAnsi="微软雅黑" w:eastAsia="微软雅黑"/>
+                <w:b/>
+                <w:sz w:val="18"/>
+              </w:rPr>
+              <w:t>组件</w:t>
+            </w:r>
+          </w:p>
+        </w:tc>
+        <w:tc>
+          <w:tcPr>
+            <w:tcW w:type="dxa" w:w="2880"/>
+            <w:shd w:val="clear" w:color="auto" w:fill="E8EEF7"/>
+          </w:tcPr>
+          <w:p>
+            <w:r>
+              <w:rPr>
+                <w:b/>
+              </w:rPr>
+            </w:r>
+            <w:r>
+              <w:rPr>
+                <w:rFonts w:ascii="微软雅黑" w:hAnsi="微软雅黑" w:eastAsia="微软雅黑"/>
+                <w:b/>
+                <w:sz w:val="18"/>
+              </w:rPr>
+              <w:t>做法</w:t>
+            </w:r>
+          </w:p>
+        </w:tc>
+        <w:tc>
+          <w:tcPr>
+            <w:tcW w:type="dxa" w:w="2880"/>
+            <w:shd w:val="clear" w:color="auto" w:fill="E8EEF7"/>
+          </w:tcPr>
+          <w:p>
+            <w:r>
+              <w:rPr>
+                <w:b/>
+              </w:rPr>
+            </w:r>
+            <w:r>
+              <w:rPr>
+                <w:rFonts w:ascii="微软雅黑" w:hAnsi="微软雅黑" w:eastAsia="微软雅黑"/>
+                <w:b/>
+                <w:sz w:val="18"/>
+              </w:rPr>
+              <w:t>为什么</w:t>
+            </w:r>
+          </w:p>
+        </w:tc>
+      </w:tr>
+      <w:tr>
+        <w:tc>
+          <w:tcPr>
+            <w:tcW w:type="dxa" w:w="2880"/>
+          </w:tcPr>
+          <w:p>
+            <w:r/>
+            <w:r>
+              <w:rPr>
+                <w:rFonts w:ascii="微软雅黑" w:hAnsi="微软雅黑" w:eastAsia="微软雅黑"/>
+                <w:b w:val="0"/>
+                <w:sz w:val="18"/>
+              </w:rPr>
+              <w:t>时钟</w:t>
+            </w:r>
+          </w:p>
+        </w:tc>
+        <w:tc>
+          <w:tcPr>
+            <w:tcW w:type="dxa" w:w="2880"/>
+          </w:tcPr>
+          <w:p>
+            <w:r/>
+            <w:r>
+              <w:rPr>
+                <w:rFonts w:ascii="微软雅黑" w:hAnsi="微软雅黑" w:eastAsia="微软雅黑"/>
+                <w:b w:val="0"/>
+                <w:sz w:val="18"/>
+              </w:rPr>
+              <w:t xml:space="preserve">两个 </w:t>
+            </w:r>
+            <w:r>
+              <w:rPr>
+                <w:rFonts w:ascii="Consolas" w:hAnsi="Consolas" w:eastAsia="Consolas"/>
+                <w:sz w:val="17"/>
+              </w:rPr>
+              <w:t>clk_wiz</w:t>
+            </w:r>
+            <w:r>
+              <w:rPr>
+                <w:rFonts w:ascii="微软雅黑" w:hAnsi="微软雅黑" w:eastAsia="微软雅黑"/>
+                <w:b w:val="0"/>
+                <w:sz w:val="18"/>
+              </w:rPr>
+              <w:t xml:space="preserve">：LCD 走外部 50 MHz 引脚，HDMI 走 PS </w:t>
+            </w:r>
+            <w:r>
+              <w:rPr>
+                <w:rFonts w:ascii="Consolas" w:hAnsi="Consolas" w:eastAsia="Consolas"/>
+                <w:sz w:val="17"/>
+              </w:rPr>
+              <w:t>FCLK_CLK0</w:t>
+            </w:r>
+          </w:p>
+        </w:tc>
+        <w:tc>
+          <w:tcPr>
+            <w:tcW w:type="dxa" w:w="2880"/>
+          </w:tcPr>
+          <w:p>
+            <w:r/>
+            <w:r>
+              <w:rPr>
+                <w:rFonts w:ascii="微软雅黑" w:hAnsi="微软雅黑" w:eastAsia="微软雅黑"/>
+                <w:b w:val="0"/>
+                <w:sz w:val="18"/>
+              </w:rPr>
+              <w:t>输入源不同，不违反「一个引脚只能一个 IBUF」</w:t>
+            </w:r>
+          </w:p>
+        </w:tc>
+      </w:tr>
+      <w:tr>
+        <w:tc>
+          <w:tcPr>
+            <w:tcW w:type="dxa" w:w="2880"/>
+          </w:tcPr>
+          <w:p>
+            <w:r/>
+            <w:r>
+              <w:rPr>
+                <w:rFonts w:ascii="微软雅黑" w:hAnsi="微软雅黑" w:eastAsia="微软雅黑"/>
+                <w:b w:val="0"/>
+                <w:sz w:val="18"/>
+              </w:rPr>
+              <w:t>主控总线</w:t>
+            </w:r>
+          </w:p>
+        </w:tc>
+        <w:tc>
+          <w:tcPr>
+            <w:tcW w:type="dxa" w:w="2880"/>
+          </w:tcPr>
+          <w:p>
+            <w:r/>
+            <w:r>
+              <w:rPr>
+                <w:rFonts w:ascii="Consolas" w:hAnsi="Consolas" w:eastAsia="Consolas"/>
+                <w:sz w:val="17"/>
+              </w:rPr>
+              <w:t>axi_smc</w:t>
+            </w:r>
+            <w:r>
+              <w:rPr>
+                <w:rFonts w:ascii="微软雅黑" w:hAnsi="微软雅黑" w:eastAsia="微软雅黑"/>
+                <w:b w:val="0"/>
+                <w:sz w:val="18"/>
+              </w:rPr>
+              <w:t xml:space="preserve">（10 个 MI），M09 → </w:t>
+            </w:r>
+            <w:r>
+              <w:rPr>
+                <w:rFonts w:ascii="Consolas" w:hAnsi="Consolas" w:eastAsia="Consolas"/>
+                <w:sz w:val="17"/>
+              </w:rPr>
+              <w:t>axi_clock_converter</w:t>
+            </w:r>
+            <w:r>
+              <w:rPr>
+                <w:rFonts w:ascii="微软雅黑" w:hAnsi="微软雅黑" w:eastAsia="微软雅黑"/>
+                <w:b w:val="0"/>
+                <w:sz w:val="18"/>
+              </w:rPr>
+              <w:t xml:space="preserve"> → </w:t>
+            </w:r>
+            <w:r>
+              <w:rPr>
+                <w:rFonts w:ascii="Consolas" w:hAnsi="Consolas" w:eastAsia="Consolas"/>
+                <w:sz w:val="17"/>
+              </w:rPr>
+              <w:t>hdmi_smc</w:t>
+            </w:r>
+          </w:p>
+        </w:tc>
+        <w:tc>
+          <w:tcPr>
+            <w:tcW w:type="dxa" w:w="2880"/>
+          </w:tcPr>
+          <w:p>
+            <w:r/>
+            <w:r>
+              <w:rPr>
+                <w:rFonts w:ascii="Consolas" w:hAnsi="Consolas" w:eastAsia="Consolas"/>
+                <w:sz w:val="17"/>
+              </w:rPr>
+              <w:t>M_AXI_GP0</w:t>
+            </w:r>
+            <w:r>
+              <w:rPr>
+                <w:rFonts w:ascii="微软雅黑" w:hAnsi="微软雅黑" w:eastAsia="微软雅黑"/>
+                <w:b w:val="0"/>
+                <w:sz w:val="18"/>
+              </w:rPr>
+              <w:t xml:space="preserve"> 只能有一个从设备分支；HDMI 的 GPIO 必须挂在 pclk 域</w:t>
+            </w:r>
+          </w:p>
+        </w:tc>
+      </w:tr>
+      <w:tr>
+        <w:tc>
+          <w:tcPr>
+            <w:tcW w:type="dxa" w:w="2880"/>
+          </w:tcPr>
+          <w:p>
+            <w:r/>
+            <w:r>
+              <w:rPr>
+                <w:rFonts w:ascii="微软雅黑" w:hAnsi="微软雅黑" w:eastAsia="微软雅黑"/>
+                <w:b w:val="0"/>
+                <w:sz w:val="18"/>
+              </w:rPr>
+              <w:t>HP 口</w:t>
+            </w:r>
+          </w:p>
+        </w:tc>
+        <w:tc>
+          <w:tcPr>
+            <w:tcW w:type="dxa" w:w="2880"/>
+          </w:tcPr>
+          <w:p>
+            <w:r/>
+            <w:r>
+              <w:rPr>
+                <w:rFonts w:ascii="Consolas" w:hAnsi="Consolas" w:eastAsia="Consolas"/>
+                <w:sz w:val="17"/>
+              </w:rPr>
+              <w:t>hp_smc</w:t>
+            </w:r>
+            <w:r>
+              <w:rPr>
+                <w:rFonts w:ascii="微软雅黑" w:hAnsi="微软雅黑" w:eastAsia="微软雅黑"/>
+                <w:b w:val="0"/>
+                <w:sz w:val="18"/>
+              </w:rPr>
+              <w:t xml:space="preserve">（AXI4→AXI3）→ </w:t>
+            </w:r>
+            <w:r>
+              <w:rPr>
+                <w:rFonts w:ascii="Consolas" w:hAnsi="Consolas" w:eastAsia="Consolas"/>
+                <w:sz w:val="17"/>
+              </w:rPr>
+              <w:t>S_AXI_HP0</w:t>
+            </w:r>
+            <w:r>
+              <w:rPr>
+                <w:rFonts w:ascii="微软雅黑" w:hAnsi="微软雅黑" w:eastAsia="微软雅黑"/>
+                <w:b w:val="0"/>
+                <w:sz w:val="18"/>
+              </w:rPr>
+              <w:t>，</w:t>
+            </w:r>
+            <w:r>
+              <w:rPr>
+                <w:rFonts w:ascii="Consolas" w:hAnsi="Consolas" w:eastAsia="Consolas"/>
+                <w:sz w:val="17"/>
+              </w:rPr>
+              <w:t>ACLK</w:t>
+            </w:r>
+            <w:r>
+              <w:rPr>
+                <w:rFonts w:ascii="微软雅黑" w:hAnsi="微软雅黑" w:eastAsia="微软雅黑"/>
+                <w:b w:val="0"/>
+                <w:sz w:val="18"/>
+              </w:rPr>
+              <w:t xml:space="preserve"> 与 pclk 同源</w:t>
+            </w:r>
+          </w:p>
+        </w:tc>
+        <w:tc>
+          <w:tcPr>
+            <w:tcW w:type="dxa" w:w="2880"/>
+          </w:tcPr>
+          <w:p>
+            <w:r/>
+            <w:r>
+              <w:rPr>
+                <w:rFonts w:ascii="微软雅黑" w:hAnsi="微软雅黑" w:eastAsia="微软雅黑"/>
+                <w:b w:val="0"/>
+                <w:sz w:val="18"/>
+              </w:rPr>
+              <w:t>Zynq HP 是 AXI3；</w:t>
+            </w:r>
+            <w:r>
+              <w:rPr>
+                <w:rFonts w:ascii="Consolas" w:hAnsi="Consolas" w:eastAsia="Consolas"/>
+                <w:sz w:val="17"/>
+              </w:rPr>
+              <w:t>fb_scanout</w:t>
+            </w:r>
+            <w:r>
+              <w:rPr>
+                <w:rFonts w:ascii="微软雅黑" w:hAnsi="微软雅黑" w:eastAsia="微软雅黑"/>
+                <w:b w:val="0"/>
+                <w:sz w:val="18"/>
+              </w:rPr>
+              <w:t xml:space="preserve"> 内无跨时钟桥</w:t>
+            </w:r>
+          </w:p>
+        </w:tc>
+      </w:tr>
+      <w:tr>
+        <w:tc>
+          <w:tcPr>
+            <w:tcW w:type="dxa" w:w="2880"/>
+          </w:tcPr>
+          <w:p>
+            <w:r/>
+            <w:r>
+              <w:rPr>
+                <w:rFonts w:ascii="微软雅黑" w:hAnsi="微软雅黑" w:eastAsia="微软雅黑"/>
+                <w:b w:val="0"/>
+                <w:sz w:val="18"/>
+              </w:rPr>
+              <w:t>地址</w:t>
+            </w:r>
+          </w:p>
+        </w:tc>
+        <w:tc>
+          <w:tcPr>
+            <w:tcW w:type="dxa" w:w="2880"/>
+          </w:tcPr>
+          <w:p>
+            <w:r/>
+            <w:r>
+              <w:rPr>
+                <w:rFonts w:ascii="微软雅黑" w:hAnsi="微软雅黑" w:eastAsia="微软雅黑"/>
+                <w:b w:val="0"/>
+                <w:sz w:val="18"/>
+              </w:rPr>
+              <w:t>只迁两条：</w:t>
+            </w:r>
+            <w:r>
+              <w:rPr>
+                <w:rFonts w:ascii="Consolas" w:hAnsi="Consolas" w:eastAsia="Consolas"/>
+                <w:sz w:val="17"/>
+              </w:rPr>
+              <w:t>gpio_id</w:t>
+            </w:r>
+            <w:r>
+              <w:rPr>
+                <w:rFonts w:ascii="微软雅黑" w:hAnsi="微软雅黑" w:eastAsia="微软雅黑"/>
+                <w:b w:val="0"/>
+                <w:sz w:val="18"/>
+              </w:rPr>
+              <w:t>→</w:t>
+            </w:r>
+            <w:r>
+              <w:rPr>
+                <w:rFonts w:ascii="Consolas" w:hAnsi="Consolas" w:eastAsia="Consolas"/>
+                <w:sz w:val="17"/>
+              </w:rPr>
+              <w:t>0x41270000</w:t>
+            </w:r>
+            <w:r>
+              <w:rPr>
+                <w:rFonts w:ascii="微软雅黑" w:hAnsi="微软雅黑" w:eastAsia="微软雅黑"/>
+                <w:b w:val="0"/>
+                <w:sz w:val="18"/>
+              </w:rPr>
+              <w:t>、</w:t>
+            </w:r>
+            <w:r>
+              <w:rPr>
+                <w:rFonts w:ascii="Consolas" w:hAnsi="Consolas" w:eastAsia="Consolas"/>
+                <w:sz w:val="17"/>
+              </w:rPr>
+              <w:t>gpio_t</w:t>
+            </w:r>
+            <w:r>
+              <w:rPr>
+                <w:rFonts w:ascii="微软雅黑" w:hAnsi="微软雅黑" w:eastAsia="微软雅黑"/>
+                <w:b w:val="0"/>
+                <w:sz w:val="18"/>
+              </w:rPr>
+              <w:t>→</w:t>
+            </w:r>
+            <w:r>
+              <w:rPr>
+                <w:rFonts w:ascii="Consolas" w:hAnsi="Consolas" w:eastAsia="Consolas"/>
+                <w:sz w:val="17"/>
+              </w:rPr>
+              <w:t>0x41280000</w:t>
+            </w:r>
+          </w:p>
+        </w:tc>
+        <w:tc>
+          <w:tcPr>
+            <w:tcW w:type="dxa" w:w="2880"/>
+          </w:tcPr>
+          <w:p>
+            <w:r/>
+            <w:r>
+              <w:rPr>
+                <w:rFonts w:ascii="Consolas" w:hAnsi="Consolas" w:eastAsia="Consolas"/>
+                <w:sz w:val="17"/>
+              </w:rPr>
+              <w:t>0x4120/0x4121</w:t>
+            </w:r>
+            <w:r>
+              <w:rPr>
+                <w:rFonts w:ascii="微软雅黑" w:hAnsi="微软雅黑" w:eastAsia="微软雅黑"/>
+                <w:b w:val="0"/>
+                <w:sz w:val="18"/>
+              </w:rPr>
+              <w:t xml:space="preserve"> 是 </w:t>
+            </w:r>
+            <w:r>
+              <w:rPr>
+                <w:rFonts w:ascii="Consolas" w:hAnsi="Consolas" w:eastAsia="Consolas"/>
+                <w:sz w:val="17"/>
+              </w:rPr>
+              <w:t>hdmi_video.py</w:t>
+            </w:r>
+            <w:r>
+              <w:rPr>
+                <w:rFonts w:ascii="微软雅黑" w:hAnsi="微软雅黑" w:eastAsia="微软雅黑"/>
+                <w:b w:val="0"/>
+                <w:sz w:val="18"/>
+              </w:rPr>
+              <w:t xml:space="preserve"> 写死的，动它风险更大</w:t>
+            </w:r>
+          </w:p>
+        </w:tc>
+      </w:tr>
+    </w:tbl>
+    <w:p/>
+    <w:p>
+      <w:pPr>
+        <w:spacing w:after="120"/>
+        <w:ind w:firstLine="0"/>
+      </w:pPr>
+      <w:r>
+        <w:rPr>
+          <w:rFonts w:ascii="微软雅黑" w:hAnsi="微软雅黑" w:eastAsia="微软雅黑"/>
+          <w:b/>
+          <w:sz w:val="21"/>
+        </w:rPr>
+        <w:t>出片结果</w:t>
+      </w:r>
+      <w:r>
+        <w:rPr>
+          <w:rFonts w:ascii="微软雅黑" w:hAnsi="微软雅黑" w:eastAsia="微软雅黑"/>
+          <w:b w:val="0"/>
+          <w:sz w:val="21"/>
+        </w:rPr>
+        <w:t>：</w:t>
+      </w:r>
+    </w:p>
+    <w:tbl>
+      <w:tblPr>
+        <w:tblStyle w:val="TableGrid"/>
+        <w:tblW w:type="auto" w:w="0"/>
+        <w:jc w:val="center"/>
+        <w:tblLook w:firstColumn="1" w:firstRow="1" w:lastColumn="0" w:lastRow="0" w:noHBand="0" w:noVBand="1" w:val="04A0"/>
+      </w:tblPr>
+      <w:tblGrid>
+        <w:gridCol w:w="4320"/>
+        <w:gridCol w:w="4320"/>
+      </w:tblGrid>
+      <w:tr>
+        <w:tc>
+          <w:tcPr>
+            <w:tcW w:type="dxa" w:w="4320"/>
+            <w:shd w:val="clear" w:color="auto" w:fill="E8EEF7"/>
+          </w:tcPr>
+          <w:p>
+            <w:r>
+              <w:rPr>
+                <w:b/>
+              </w:rPr>
+            </w:r>
+            <w:r>
+              <w:rPr>
+                <w:rFonts w:ascii="微软雅黑" w:hAnsi="微软雅黑" w:eastAsia="微软雅黑"/>
+                <w:b/>
+                <w:sz w:val="18"/>
+              </w:rPr>
+              <w:t>项</w:t>
+            </w:r>
+          </w:p>
+        </w:tc>
+        <w:tc>
+          <w:tcPr>
+            <w:tcW w:type="dxa" w:w="4320"/>
+            <w:shd w:val="clear" w:color="auto" w:fill="E8EEF7"/>
+          </w:tcPr>
+          <w:p>
+            <w:r>
+              <w:rPr>
+                <w:b/>
+              </w:rPr>
+            </w:r>
+            <w:r>
+              <w:rPr>
+                <w:rFonts w:ascii="微软雅黑" w:hAnsi="微软雅黑" w:eastAsia="微软雅黑"/>
+                <w:b/>
+                <w:sz w:val="18"/>
+              </w:rPr>
+              <w:t>值</w:t>
+            </w:r>
+          </w:p>
+        </w:tc>
+      </w:tr>
+      <w:tr>
+        <w:tc>
+          <w:tcPr>
+            <w:tcW w:type="dxa" w:w="4320"/>
+          </w:tcPr>
+          <w:p>
+            <w:r/>
+            <w:r>
+              <w:rPr>
+                <w:rFonts w:ascii="微软雅黑" w:hAnsi="微软雅黑" w:eastAsia="微软雅黑"/>
+                <w:b w:val="0"/>
+                <w:sz w:val="18"/>
+              </w:rPr>
+              <w:t>令牌</w:t>
+            </w:r>
+          </w:p>
+        </w:tc>
+        <w:tc>
+          <w:tcPr>
+            <w:tcW w:type="dxa" w:w="4320"/>
+          </w:tcPr>
+          <w:p>
+            <w:r/>
+            <w:r>
+              <w:rPr>
+                <w:rFonts w:ascii="Consolas" w:hAnsi="Consolas" w:eastAsia="Consolas"/>
+                <w:sz w:val="17"/>
+              </w:rPr>
+              <w:t>FLOW_SYSTEM_BD_OK</w:t>
+            </w:r>
+          </w:p>
+        </w:tc>
+      </w:tr>
+      <w:tr>
+        <w:tc>
+          <w:tcPr>
+            <w:tcW w:type="dxa" w:w="4320"/>
+          </w:tcPr>
+          <w:p>
+            <w:r/>
+            <w:r>
+              <w:rPr>
+                <w:rFonts w:ascii="微软雅黑" w:hAnsi="微软雅黑" w:eastAsia="微软雅黑"/>
+                <w:b w:val="0"/>
+                <w:sz w:val="18"/>
+              </w:rPr>
+              <w:t>WNS / WHS</w:t>
+            </w:r>
+          </w:p>
+        </w:tc>
+        <w:tc>
+          <w:tcPr>
+            <w:tcW w:type="dxa" w:w="4320"/>
+          </w:tcPr>
+          <w:p>
+            <w:r/>
+            <w:r>
+              <w:rPr>
+                <w:rFonts w:ascii="微软雅黑" w:hAnsi="微软雅黑" w:eastAsia="微软雅黑"/>
+                <w:b/>
+                <w:sz w:val="18"/>
+              </w:rPr>
+              <w:t>+3.042 ns / +0.028 ns</w:t>
+            </w:r>
+            <w:r>
+              <w:rPr>
+                <w:rFonts w:ascii="微软雅黑" w:hAnsi="微软雅黑" w:eastAsia="微软雅黑"/>
+                <w:b w:val="0"/>
+                <w:sz w:val="18"/>
+              </w:rPr>
+              <w:t>，失败端点 0</w:t>
+            </w:r>
+          </w:p>
+        </w:tc>
+      </w:tr>
+      <w:tr>
+        <w:tc>
+          <w:tcPr>
+            <w:tcW w:type="dxa" w:w="4320"/>
+          </w:tcPr>
+          <w:p>
+            <w:r/>
+            <w:r>
+              <w:rPr>
+                <w:rFonts w:ascii="微软雅黑" w:hAnsi="微软雅黑" w:eastAsia="微软雅黑"/>
+                <w:b w:val="0"/>
+                <w:sz w:val="18"/>
+              </w:rPr>
+              <w:t>Slice LUT</w:t>
+            </w:r>
+          </w:p>
+        </w:tc>
+        <w:tc>
+          <w:tcPr>
+            <w:tcW w:type="dxa" w:w="4320"/>
+          </w:tcPr>
+          <w:p>
+            <w:r/>
+            <w:r>
+              <w:rPr>
+                <w:rFonts w:ascii="微软雅黑" w:hAnsi="微软雅黑" w:eastAsia="微软雅黑"/>
+                <w:b w:val="0"/>
+                <w:sz w:val="18"/>
+              </w:rPr>
+              <w:t>23,865（44.9%）</w:t>
+            </w:r>
+          </w:p>
+        </w:tc>
+      </w:tr>
+      <w:tr>
+        <w:tc>
+          <w:tcPr>
+            <w:tcW w:type="dxa" w:w="4320"/>
+          </w:tcPr>
+          <w:p>
+            <w:r/>
+            <w:r>
+              <w:rPr>
+                <w:rFonts w:ascii="微软雅黑" w:hAnsi="微软雅黑" w:eastAsia="微软雅黑"/>
+                <w:b w:val="0"/>
+                <w:sz w:val="18"/>
+              </w:rPr>
+              <w:t>Slice Registers</w:t>
+            </w:r>
+          </w:p>
+        </w:tc>
+        <w:tc>
+          <w:tcPr>
+            <w:tcW w:type="dxa" w:w="4320"/>
+          </w:tcPr>
+          <w:p>
+            <w:r/>
+            <w:r>
+              <w:rPr>
+                <w:rFonts w:ascii="微软雅黑" w:hAnsi="微软雅黑" w:eastAsia="微软雅黑"/>
+                <w:b w:val="0"/>
+                <w:sz w:val="18"/>
+              </w:rPr>
+              <w:t>31,255（29.4%）</w:t>
+            </w:r>
+          </w:p>
+        </w:tc>
+      </w:tr>
+      <w:tr>
+        <w:tc>
+          <w:tcPr>
+            <w:tcW w:type="dxa" w:w="4320"/>
+          </w:tcPr>
+          <w:p>
+            <w:r/>
+            <w:r>
+              <w:rPr>
+                <w:rFonts w:ascii="微软雅黑" w:hAnsi="微软雅黑" w:eastAsia="微软雅黑"/>
+                <w:b w:val="0"/>
+                <w:sz w:val="18"/>
+              </w:rPr>
+              <w:t>Block RAM</w:t>
+            </w:r>
+          </w:p>
+        </w:tc>
+        <w:tc>
+          <w:tcPr>
+            <w:tcW w:type="dxa" w:w="4320"/>
+          </w:tcPr>
+          <w:p>
+            <w:r/>
+            <w:r>
+              <w:rPr>
+                <w:rFonts w:ascii="微软雅黑" w:hAnsi="微软雅黑" w:eastAsia="微软雅黑"/>
+                <w:b w:val="0"/>
+                <w:sz w:val="18"/>
+              </w:rPr>
+              <w:t>86 / 140（61.4%）</w:t>
+            </w:r>
+          </w:p>
+        </w:tc>
+      </w:tr>
+      <w:tr>
+        <w:tc>
+          <w:tcPr>
+            <w:tcW w:type="dxa" w:w="4320"/>
+          </w:tcPr>
+          <w:p>
+            <w:r/>
+            <w:r>
+              <w:rPr>
+                <w:rFonts w:ascii="微软雅黑" w:hAnsi="微软雅黑" w:eastAsia="微软雅黑"/>
+                <w:b w:val="0"/>
+                <w:sz w:val="18"/>
+              </w:rPr>
+              <w:t>MMCM</w:t>
+            </w:r>
+          </w:p>
+        </w:tc>
+        <w:tc>
+          <w:tcPr>
+            <w:tcW w:type="dxa" w:w="4320"/>
+          </w:tcPr>
+          <w:p>
+            <w:r/>
+            <w:r>
+              <w:rPr>
+                <w:rFonts w:ascii="微软雅黑" w:hAnsi="微软雅黑" w:eastAsia="微软雅黑"/>
+                <w:b w:val="0"/>
+                <w:sz w:val="18"/>
+              </w:rPr>
+              <w:t>2 / 4</w:t>
+            </w:r>
+          </w:p>
+        </w:tc>
+      </w:tr>
+      <w:tr>
+        <w:tc>
+          <w:tcPr>
+            <w:tcW w:type="dxa" w:w="4320"/>
+          </w:tcPr>
+          <w:p>
+            <w:r/>
+            <w:r>
+              <w:rPr>
+                <w:rFonts w:ascii="微软雅黑" w:hAnsi="微软雅黑" w:eastAsia="微软雅黑"/>
+                <w:b w:val="0"/>
+                <w:sz w:val="18"/>
+              </w:rPr>
+              <w:t>地址表与 hwh 对拍</w:t>
+            </w:r>
+          </w:p>
+        </w:tc>
+        <w:tc>
+          <w:tcPr>
+            <w:tcW w:type="dxa" w:w="4320"/>
+          </w:tcPr>
+          <w:p>
+            <w:r/>
+            <w:r>
+              <w:rPr>
+                <w:rFonts w:ascii="微软雅黑" w:hAnsi="微软雅黑" w:eastAsia="微软雅黑"/>
+                <w:b w:val="0"/>
+                <w:sz w:val="18"/>
+              </w:rPr>
+              <w:t>11 个从设备逐条一致</w:t>
+            </w:r>
+          </w:p>
+        </w:tc>
+      </w:tr>
+    </w:tbl>
+    <w:p/>
+    <w:p>
+      <w:pPr>
+        <w:spacing w:after="120"/>
+        <w:ind w:firstLine="0"/>
+      </w:pPr>
+      <w:r>
+        <w:rPr>
+          <w:rFonts w:ascii="微软雅黑" w:hAnsi="微软雅黑" w:eastAsia="微软雅黑"/>
+          <w:b w:val="0"/>
+          <w:sz w:val="21"/>
+        </w:rPr>
+        <w:t>★ 一个必须记住的教训：</w:t>
+      </w:r>
+      <w:r>
+        <w:rPr>
+          <w:rFonts w:ascii="微软雅黑" w:hAnsi="微软雅黑" w:eastAsia="微软雅黑"/>
+          <w:b/>
+          <w:sz w:val="21"/>
+        </w:rPr>
+        <w:t>互连的开销不能按单体相加估</w:t>
+      </w:r>
+      <w:r>
+        <w:rPr>
+          <w:rFonts w:ascii="微软雅黑" w:hAnsi="微软雅黑" w:eastAsia="微软雅黑"/>
+          <w:b w:val="0"/>
+          <w:sz w:val="21"/>
+        </w:rPr>
+        <w:t xml:space="preserve">。两个设计单独出片时 LUT 分别是 19.0% 和 11.1%，相加约 30%；实际合并后 44.9%，差额全在 </w:t>
+      </w:r>
+      <w:r>
+        <w:rPr>
+          <w:rFonts w:ascii="Consolas" w:hAnsi="Consolas" w:eastAsia="Consolas"/>
+          <w:sz w:val="20"/>
+        </w:rPr>
+        <w:t>axi_smc</w:t>
+      </w:r>
+      <w:r>
+        <w:rPr>
+          <w:rFonts w:ascii="微软雅黑" w:hAnsi="微软雅黑" w:eastAsia="微软雅黑"/>
+          <w:b w:val="0"/>
+          <w:sz w:val="21"/>
+        </w:rPr>
+        <w:t xml:space="preserve">(10 MI) + </w:t>
+      </w:r>
+      <w:r>
+        <w:rPr>
+          <w:rFonts w:ascii="Consolas" w:hAnsi="Consolas" w:eastAsia="Consolas"/>
+          <w:sz w:val="20"/>
+        </w:rPr>
+        <w:t>axi_clock_converter</w:t>
+      </w:r>
+      <w:r>
+        <w:rPr>
+          <w:rFonts w:ascii="微软雅黑" w:hAnsi="微软雅黑" w:eastAsia="微软雅黑"/>
+          <w:b w:val="0"/>
+          <w:sz w:val="21"/>
+        </w:rPr>
+        <w:t xml:space="preserve"> + </w:t>
+      </w:r>
+      <w:r>
+        <w:rPr>
+          <w:rFonts w:ascii="Consolas" w:hAnsi="Consolas" w:eastAsia="Consolas"/>
+          <w:sz w:val="20"/>
+        </w:rPr>
+        <w:t>hdmi_smc</w:t>
+      </w:r>
+      <w:r>
+        <w:rPr>
+          <w:rFonts w:ascii="微软雅黑" w:hAnsi="微软雅黑" w:eastAsia="微软雅黑"/>
+          <w:b w:val="0"/>
+          <w:sz w:val="21"/>
+        </w:rPr>
+        <w:t xml:space="preserve"> + </w:t>
+      </w:r>
+      <w:r>
+        <w:rPr>
+          <w:rFonts w:ascii="Consolas" w:hAnsi="Consolas" w:eastAsia="Consolas"/>
+          <w:sz w:val="20"/>
+        </w:rPr>
+        <w:t>hp_smc</w:t>
+      </w:r>
+      <w:r>
+        <w:rPr>
+          <w:rFonts w:ascii="微软雅黑" w:hAnsi="微软雅黑" w:eastAsia="微软雅黑"/>
+          <w:b w:val="0"/>
+          <w:sz w:val="21"/>
+        </w:rPr>
+        <w:t xml:space="preserve"> 四个互连 IP 上。</w:t>
+      </w:r>
+    </w:p>
+    <w:p>
+      <w:pPr>
+        <w:spacing w:after="120"/>
+        <w:ind w:firstLine="0"/>
+      </w:pPr>
+      <w:r>
+        <w:rPr>
+          <w:rFonts w:ascii="微软雅黑" w:hAnsi="微软雅黑" w:eastAsia="微软雅黑"/>
+          <w:b/>
+          <w:sz w:val="21"/>
+        </w:rPr>
+        <w:t>构建期的一个真坑</w:t>
+      </w:r>
+      <w:r>
+        <w:rPr>
+          <w:rFonts w:ascii="微软雅黑" w:hAnsi="微软雅黑" w:eastAsia="微软雅黑"/>
+          <w:b w:val="0"/>
+          <w:sz w:val="21"/>
+        </w:rPr>
+        <w:t>：</w:t>
+      </w:r>
+      <w:r>
+        <w:rPr>
+          <w:rFonts w:ascii="Consolas" w:hAnsi="Consolas" w:eastAsia="Consolas"/>
+          <w:sz w:val="20"/>
+        </w:rPr>
+        <w:t>create_bd_design</w:t>
+      </w:r>
+      <w:r>
+        <w:rPr>
+          <w:rFonts w:ascii="微软雅黑" w:hAnsi="微软雅黑" w:eastAsia="微软雅黑"/>
+          <w:b w:val="0"/>
+          <w:sz w:val="21"/>
+        </w:rPr>
+        <w:t xml:space="preserve"> 报 </w:t>
+      </w:r>
+      <w:r>
+        <w:rPr>
+          <w:rFonts w:ascii="Consolas" w:hAnsi="Consolas" w:eastAsia="Consolas"/>
+          <w:sz w:val="20"/>
+        </w:rPr>
+        <w:t>couldn't read file "init.tcl": No error</w:t>
+      </w:r>
+      <w:r>
+        <w:rPr>
+          <w:rFonts w:ascii="微软雅黑" w:hAnsi="微软雅黑" w:eastAsia="微软雅黑"/>
+          <w:b w:val="0"/>
+          <w:sz w:val="21"/>
+        </w:rPr>
+        <w:t>。 仓库里记的旧对策是「按绝对路径预加载 IP 库」，这次</w:t>
+      </w:r>
+      <w:r>
+        <w:rPr>
+          <w:rFonts w:ascii="微软雅黑" w:hAnsi="微软雅黑" w:eastAsia="微软雅黑"/>
+          <w:b/>
+          <w:sz w:val="21"/>
+        </w:rPr>
+        <w:t>连绝对路径 `source` 都读不到</w:t>
+      </w:r>
+      <w:r>
+        <w:rPr>
+          <w:rFonts w:ascii="微软雅黑" w:hAnsi="微软雅黑" w:eastAsia="微软雅黑"/>
+          <w:b w:val="0"/>
+          <w:sz w:val="21"/>
+        </w:rPr>
+        <w:t>， 预加载不够；改成</w:t>
+      </w:r>
+      <w:r>
+        <w:rPr>
+          <w:rFonts w:ascii="微软雅黑" w:hAnsi="微软雅黑" w:eastAsia="微软雅黑"/>
+          <w:b/>
+          <w:sz w:val="21"/>
+        </w:rPr>
+        <w:t>建图期间把 cwd 切到 `$ipintegrator`</w:t>
+      </w:r>
+      <w:r>
+        <w:rPr>
+          <w:rFonts w:ascii="微软雅黑" w:hAnsi="微软雅黑" w:eastAsia="微软雅黑"/>
+          <w:b w:val="0"/>
+          <w:sz w:val="21"/>
+        </w:rPr>
+        <w:t xml:space="preserve"> 才通过。</w:t>
+      </w:r>
+    </w:p>
+    <w:p>
+      <w:pPr>
+        <w:spacing w:after="120"/>
+        <w:ind w:firstLine="0"/>
+      </w:pPr>
+      <w:r>
+        <w:rPr>
+          <w:rFonts w:ascii="微软雅黑" w:hAnsi="微软雅黑" w:eastAsia="微软雅黑"/>
+          <w:b/>
+          <w:sz w:val="21"/>
+        </w:rPr>
+        <w:t>分层测试集</w:t>
+      </w:r>
+      <w:r>
+        <w:rPr>
+          <w:rFonts w:ascii="微软雅黑" w:hAnsi="微软雅黑" w:eastAsia="微软雅黑"/>
+          <w:b w:val="0"/>
+          <w:sz w:val="21"/>
+        </w:rPr>
+        <w:t xml:space="preserve">：原先上板只用 </w:t>
+      </w:r>
+      <w:r>
+        <w:rPr>
+          <w:rFonts w:ascii="Consolas" w:hAnsi="Consolas" w:eastAsia="Consolas"/>
+          <w:sz w:val="20"/>
+        </w:rPr>
+        <w:t>data/samples/incidents/</w:t>
+      </w:r>
+      <w:r>
+        <w:rPr>
+          <w:rFonts w:ascii="微软雅黑" w:hAnsi="微软雅黑" w:eastAsia="微软雅黑"/>
+          <w:b w:val="0"/>
+          <w:sz w:val="21"/>
+        </w:rPr>
+        <w:t xml:space="preserve"> 的 12 段录像 —— 那些是 </w:t>
+      </w:r>
+      <w:r>
+        <w:rPr>
+          <w:rFonts w:ascii="Consolas" w:hAnsi="Consolas" w:eastAsia="Consolas"/>
+          <w:sz w:val="20"/>
+        </w:rPr>
+        <w:t>find_incidents.py</w:t>
+      </w:r>
+      <w:r>
+        <w:rPr>
+          <w:rFonts w:ascii="微软雅黑" w:hAnsi="微软雅黑" w:eastAsia="微软雅黑"/>
+          <w:b w:val="0"/>
+          <w:sz w:val="21"/>
+        </w:rPr>
+        <w:t xml:space="preserve"> 按「导播切回放」挑的，</w:t>
+      </w:r>
+      <w:r>
+        <w:rPr>
+          <w:rFonts w:ascii="微软雅黑" w:hAnsi="微软雅黑" w:eastAsia="微软雅黑"/>
+          <w:b/>
+          <w:sz w:val="21"/>
+        </w:rPr>
+        <w:t>只代表最难的一类画面</w:t>
+      </w:r>
+      <w:r>
+        <w:rPr>
+          <w:rFonts w:ascii="微软雅黑" w:hAnsi="微软雅黑" w:eastAsia="微软雅黑"/>
+          <w:b w:val="0"/>
+          <w:sz w:val="21"/>
+        </w:rPr>
+        <w:t xml:space="preserve">。新增 </w:t>
+      </w:r>
+      <w:r>
+        <w:rPr>
+          <w:rFonts w:ascii="Consolas" w:hAnsi="Consolas" w:eastAsia="Consolas"/>
+          <w:sz w:val="20"/>
+        </w:rPr>
+        <w:t>tools/split_scenes.py</w:t>
+      </w:r>
+      <w:r>
+        <w:rPr>
+          <w:rFonts w:ascii="微软雅黑" w:hAnsi="微软雅黑" w:eastAsia="微软雅黑"/>
+          <w:b w:val="0"/>
+          <w:sz w:val="21"/>
+        </w:rPr>
+        <w:t xml:space="preserve"> 按人员聚集度把整场切成两类，各 5 段 × 10 s：</w:t>
+      </w:r>
+    </w:p>
+    <w:tbl>
+      <w:tblPr>
+        <w:tblStyle w:val="TableGrid"/>
+        <w:tblW w:type="auto" w:w="0"/>
+        <w:jc w:val="center"/>
+        <w:tblLook w:firstColumn="1" w:firstRow="1" w:lastColumn="0" w:lastRow="0" w:noHBand="0" w:noVBand="1" w:val="04A0"/>
+      </w:tblPr>
+      <w:tblGrid>
+        <w:gridCol w:w="1728"/>
+        <w:gridCol w:w="1728"/>
+        <w:gridCol w:w="1728"/>
+        <w:gridCol w:w="1728"/>
+        <w:gridCol w:w="1728"/>
+      </w:tblGrid>
+      <w:tr>
+        <w:tc>
+          <w:tcPr>
+            <w:tcW w:type="dxa" w:w="1728"/>
+            <w:shd w:val="clear" w:color="auto" w:fill="E8EEF7"/>
+          </w:tcPr>
+          <w:p>
+            <w:r>
+              <w:rPr>
+                <w:b/>
+              </w:rPr>
+            </w:r>
+            <w:r>
+              <w:rPr>
+                <w:rFonts w:ascii="微软雅黑" w:hAnsi="微软雅黑" w:eastAsia="微软雅黑"/>
+                <w:b/>
+                <w:sz w:val="18"/>
+              </w:rPr>
+              <w:t>层</w:t>
+            </w:r>
+          </w:p>
+        </w:tc>
+        <w:tc>
+          <w:tcPr>
+            <w:tcW w:type="dxa" w:w="1728"/>
+            <w:shd w:val="clear" w:color="auto" w:fill="E8EEF7"/>
+          </w:tcPr>
+          <w:p>
+            <w:r>
+              <w:rPr>
+                <w:b/>
+              </w:rPr>
+            </w:r>
+            <w:r>
+              <w:rPr>
+                <w:rFonts w:ascii="微软雅黑" w:hAnsi="微软雅黑" w:eastAsia="微软雅黑"/>
+                <w:b/>
+                <w:sz w:val="18"/>
+              </w:rPr>
+              <w:t>球检出率</w:t>
+            </w:r>
+          </w:p>
+        </w:tc>
+        <w:tc>
+          <w:tcPr>
+            <w:tcW w:type="dxa" w:w="1728"/>
+            <w:shd w:val="clear" w:color="auto" w:fill="E8EEF7"/>
+          </w:tcPr>
+          <w:p>
+            <w:r>
+              <w:rPr>
+                <w:b/>
+              </w:rPr>
+            </w:r>
+            <w:r>
+              <w:rPr>
+                <w:rFonts w:ascii="微软雅黑" w:hAnsi="微软雅黑" w:eastAsia="微软雅黑"/>
+                <w:b/>
+                <w:sz w:val="18"/>
+              </w:rPr>
+              <w:t>聚集度</w:t>
+            </w:r>
+          </w:p>
+        </w:tc>
+        <w:tc>
+          <w:tcPr>
+            <w:tcW w:type="dxa" w:w="1728"/>
+            <w:shd w:val="clear" w:color="auto" w:fill="E8EEF7"/>
+          </w:tcPr>
+          <w:p>
+            <w:r>
+              <w:rPr>
+                <w:b/>
+              </w:rPr>
+            </w:r>
+            <w:r>
+              <w:rPr>
+                <w:rFonts w:ascii="微软雅黑" w:hAnsi="微软雅黑" w:eastAsia="微软雅黑"/>
+                <w:b/>
+                <w:sz w:val="18"/>
+              </w:rPr>
+              <w:t>每帧人数</w:t>
+            </w:r>
+          </w:p>
+        </w:tc>
+        <w:tc>
+          <w:tcPr>
+            <w:tcW w:type="dxa" w:w="1728"/>
+            <w:shd w:val="clear" w:color="auto" w:fill="E8EEF7"/>
+          </w:tcPr>
+          <w:p>
+            <w:r>
+              <w:rPr>
+                <w:b/>
+              </w:rPr>
+            </w:r>
+            <w:r>
+              <w:rPr>
+                <w:rFonts w:ascii="微软雅黑" w:hAnsi="微软雅黑" w:eastAsia="微软雅黑"/>
+                <w:b/>
+                <w:sz w:val="18"/>
+              </w:rPr>
+              <w:t>单帧推理（PC，640）</w:t>
+            </w:r>
+          </w:p>
+        </w:tc>
+      </w:tr>
+      <w:tr>
+        <w:tc>
+          <w:tcPr>
+            <w:tcW w:type="dxa" w:w="1728"/>
+          </w:tcPr>
+          <w:p>
+            <w:r/>
+            <w:r>
+              <w:rPr>
+                <w:rFonts w:ascii="微软雅黑" w:hAnsi="微软雅黑" w:eastAsia="微软雅黑"/>
+                <w:b w:val="0"/>
+                <w:sz w:val="18"/>
+              </w:rPr>
+              <w:t>争抢 contest</w:t>
+            </w:r>
+          </w:p>
+        </w:tc>
+        <w:tc>
+          <w:tcPr>
+            <w:tcW w:type="dxa" w:w="1728"/>
+          </w:tcPr>
+          <w:p>
+            <w:r/>
+            <w:r>
+              <w:rPr>
+                <w:rFonts w:ascii="微软雅黑" w:hAnsi="微软雅黑" w:eastAsia="微软雅黑"/>
+                <w:b/>
+                <w:sz w:val="18"/>
+              </w:rPr>
+              <w:t>11.6%</w:t>
+            </w:r>
+          </w:p>
+        </w:tc>
+        <w:tc>
+          <w:tcPr>
+            <w:tcW w:type="dxa" w:w="1728"/>
+          </w:tcPr>
+          <w:p>
+            <w:r/>
+            <w:r>
+              <w:rPr>
+                <w:rFonts w:ascii="微软雅黑" w:hAnsi="微软雅黑" w:eastAsia="微软雅黑"/>
+                <w:b w:val="0"/>
+                <w:sz w:val="18"/>
+              </w:rPr>
+              <w:t>0.171</w:t>
+            </w:r>
+          </w:p>
+        </w:tc>
+        <w:tc>
+          <w:tcPr>
+            <w:tcW w:type="dxa" w:w="1728"/>
+          </w:tcPr>
+          <w:p>
+            <w:r/>
+            <w:r>
+              <w:rPr>
+                <w:rFonts w:ascii="微软雅黑" w:hAnsi="微软雅黑" w:eastAsia="微软雅黑"/>
+                <w:b w:val="0"/>
+                <w:sz w:val="18"/>
+              </w:rPr>
+              <w:t>15.4</w:t>
+            </w:r>
+          </w:p>
+        </w:tc>
+        <w:tc>
+          <w:tcPr>
+            <w:tcW w:type="dxa" w:w="1728"/>
+          </w:tcPr>
+          <w:p>
+            <w:r/>
+            <w:r>
+              <w:rPr>
+                <w:rFonts w:ascii="微软雅黑" w:hAnsi="微软雅黑" w:eastAsia="微软雅黑"/>
+                <w:b w:val="0"/>
+                <w:sz w:val="18"/>
+              </w:rPr>
+              <w:t>42.4 ms</w:t>
+            </w:r>
+          </w:p>
+        </w:tc>
+      </w:tr>
+      <w:tr>
+        <w:tc>
+          <w:tcPr>
+            <w:tcW w:type="dxa" w:w="1728"/>
+          </w:tcPr>
+          <w:p>
+            <w:r/>
+            <w:r>
+              <w:rPr>
+                <w:rFonts w:ascii="微软雅黑" w:hAnsi="微软雅黑" w:eastAsia="微软雅黑"/>
+                <w:b w:val="0"/>
+                <w:sz w:val="18"/>
+              </w:rPr>
+              <w:t>普通 normal</w:t>
+            </w:r>
+          </w:p>
+        </w:tc>
+        <w:tc>
+          <w:tcPr>
+            <w:tcW w:type="dxa" w:w="1728"/>
+          </w:tcPr>
+          <w:p>
+            <w:r/>
+            <w:r>
+              <w:rPr>
+                <w:rFonts w:ascii="微软雅黑" w:hAnsi="微软雅黑" w:eastAsia="微软雅黑"/>
+                <w:b/>
+                <w:sz w:val="18"/>
+              </w:rPr>
+              <w:t>19.6%</w:t>
+            </w:r>
+          </w:p>
+        </w:tc>
+        <w:tc>
+          <w:tcPr>
+            <w:tcW w:type="dxa" w:w="1728"/>
+          </w:tcPr>
+          <w:p>
+            <w:r/>
+            <w:r>
+              <w:rPr>
+                <w:rFonts w:ascii="微软雅黑" w:hAnsi="微软雅黑" w:eastAsia="微软雅黑"/>
+                <w:b w:val="0"/>
+                <w:sz w:val="18"/>
+              </w:rPr>
+              <w:t>0.294</w:t>
+            </w:r>
+          </w:p>
+        </w:tc>
+        <w:tc>
+          <w:tcPr>
+            <w:tcW w:type="dxa" w:w="1728"/>
+          </w:tcPr>
+          <w:p>
+            <w:r/>
+            <w:r>
+              <w:rPr>
+                <w:rFonts w:ascii="微软雅黑" w:hAnsi="微软雅黑" w:eastAsia="微软雅黑"/>
+                <w:b w:val="0"/>
+                <w:sz w:val="18"/>
+              </w:rPr>
+              <w:t>17.5</w:t>
+            </w:r>
+          </w:p>
+        </w:tc>
+        <w:tc>
+          <w:tcPr>
+            <w:tcW w:type="dxa" w:w="1728"/>
+          </w:tcPr>
+          <w:p>
+            <w:r/>
+            <w:r>
+              <w:rPr>
+                <w:rFonts w:ascii="微软雅黑" w:hAnsi="微软雅黑" w:eastAsia="微软雅黑"/>
+                <w:b w:val="0"/>
+                <w:sz w:val="18"/>
+              </w:rPr>
+              <w:t>32.5 ms</w:t>
+            </w:r>
+          </w:p>
+        </w:tc>
+      </w:tr>
+    </w:tbl>
+    <w:p/>
+    <w:p>
+      <w:pPr>
+        <w:spacing w:after="120"/>
+        <w:ind w:firstLine="0"/>
+      </w:pPr>
+      <w:r>
+        <w:rPr>
+          <w:rFonts w:ascii="微软雅黑" w:hAnsi="微软雅黑" w:eastAsia="微软雅黑"/>
+          <w:b w:val="0"/>
+          <w:sz w:val="21"/>
+        </w:rPr>
+        <w:t xml:space="preserve">两条结论：① 球在争抢画面里确实更难检出（少 8 个百分点），分层切到了检测的薄弱面； ② </w:t>
+      </w:r>
+      <w:r>
+        <w:rPr>
+          <w:rFonts w:ascii="微软雅黑" w:hAnsi="微软雅黑" w:eastAsia="微软雅黑"/>
+          <w:b/>
+          <w:sz w:val="21"/>
+        </w:rPr>
+        <w:t>即便是普通场景，球也只有约 1/5 的帧检得到</w:t>
+      </w:r>
+      <w:r>
+        <w:rPr>
+          <w:rFonts w:ascii="微软雅黑" w:hAnsi="微软雅黑" w:eastAsia="微软雅黑"/>
+          <w:b w:val="0"/>
+          <w:sz w:val="21"/>
+        </w:rPr>
+        <w:t xml:space="preserve"> —— 这就是球门控必须存在的原因。 样本各 5 段，</w:t>
+      </w:r>
+      <w:r>
+        <w:rPr>
+          <w:rFonts w:ascii="微软雅黑" w:hAnsi="微软雅黑" w:eastAsia="微软雅黑"/>
+          <w:b/>
+          <w:sz w:val="21"/>
+        </w:rPr>
+        <w:t>不作准确率用</w:t>
+      </w:r>
+      <w:r>
+        <w:rPr>
+          <w:rFonts w:ascii="微软雅黑" w:hAnsi="微软雅黑" w:eastAsia="微软雅黑"/>
+          <w:b w:val="0"/>
+          <w:sz w:val="21"/>
+        </w:rPr>
+        <w:t>；两类标签是几何代理，</w:t>
+      </w:r>
+      <w:r>
+        <w:rPr>
+          <w:rFonts w:ascii="Consolas" w:hAnsi="Consolas" w:eastAsia="Consolas"/>
+          <w:sz w:val="20"/>
+        </w:rPr>
+        <w:t>MANIFEST.csv</w:t>
+      </w:r>
+      <w:r>
+        <w:rPr>
+          <w:rFonts w:ascii="微软雅黑" w:hAnsi="微软雅黑" w:eastAsia="微软雅黑"/>
+          <w:b w:val="0"/>
+          <w:sz w:val="21"/>
+        </w:rPr>
+        <w:t xml:space="preserve"> 的 </w:t>
+      </w:r>
+      <w:r>
+        <w:rPr>
+          <w:rFonts w:ascii="Consolas" w:hAnsi="Consolas" w:eastAsia="Consolas"/>
+          <w:sz w:val="20"/>
+        </w:rPr>
+        <w:t>human_ok</w:t>
+      </w:r>
+      <w:r>
+        <w:rPr>
+          <w:rFonts w:ascii="微软雅黑" w:hAnsi="微软雅黑" w:eastAsia="微软雅黑"/>
+          <w:b w:val="0"/>
+          <w:sz w:val="21"/>
+        </w:rPr>
+        <w:t xml:space="preserve"> 列留空等人填。</w:t>
+      </w:r>
+    </w:p>
+    <w:p>
+      <w:pPr>
+        <w:spacing w:after="120"/>
+        <w:ind w:firstLine="0"/>
+      </w:pPr>
+      <w:r>
+        <w:rPr>
+          <w:rFonts w:ascii="微软雅黑" w:hAnsi="微软雅黑" w:eastAsia="微软雅黑"/>
+          <w:b/>
+          <w:sz w:val="21"/>
+        </w:rPr>
+        <w:t>诚实边界</w:t>
+      </w:r>
+      <w:r>
+        <w:rPr>
+          <w:rFonts w:ascii="微软雅黑" w:hAnsi="微软雅黑" w:eastAsia="微软雅黑"/>
+          <w:b w:val="0"/>
+          <w:sz w:val="21"/>
+        </w:rPr>
+        <w:t>：</w:t>
+      </w:r>
+      <w:r>
+        <w:rPr>
+          <w:rFonts w:ascii="Consolas" w:hAnsi="Consolas" w:eastAsia="Consolas"/>
+          <w:sz w:val="20"/>
+        </w:rPr>
+        <w:t>flow_system.bit</w:t>
+      </w:r>
+      <w:r>
+        <w:rPr>
+          <w:rFonts w:ascii="微软雅黑" w:hAnsi="微软雅黑" w:eastAsia="微软雅黑"/>
+          <w:b w:val="0"/>
+          <w:sz w:val="21"/>
+        </w:rPr>
+        <w:t xml:space="preserve"> 2026-10-30 出片、时序收敛、地址表对拍一致， 但</w:t>
+      </w:r>
+      <w:r>
+        <w:rPr>
+          <w:rFonts w:ascii="微软雅黑" w:hAnsi="微软雅黑" w:eastAsia="微软雅黑"/>
+          <w:b/>
+          <w:sz w:val="21"/>
+        </w:rPr>
+        <w:t>尚未上板</w:t>
+      </w:r>
+      <w:r>
+        <w:rPr>
+          <w:rFonts w:ascii="微软雅黑" w:hAnsi="微软雅黑" w:eastAsia="微软雅黑"/>
+          <w:b w:val="0"/>
+          <w:sz w:val="21"/>
+        </w:rPr>
+        <w:t xml:space="preserve">（当天板子多次硬复位，见 </w:t>
+      </w:r>
+      <w:r>
+        <w:rPr>
+          <w:rFonts w:ascii="Consolas" w:hAnsi="Consolas" w:eastAsia="Consolas"/>
+          <w:sz w:val="20"/>
+        </w:rPr>
+        <w:t>docs/board_environment.md</w:t>
+      </w:r>
+      <w:r>
+        <w:rPr>
+          <w:rFonts w:ascii="微软雅黑" w:hAnsi="微软雅黑" w:eastAsia="微软雅黑"/>
+          <w:b w:val="0"/>
+          <w:sz w:val="21"/>
+        </w:rPr>
+        <w:t>）。 按本仓库纪律，未上板即不写「已验证」。</w:t>
       </w:r>
     </w:p>
     <w:p>

</xml_diff>

<commit_message>
docs(decisions): 用户 2026-10-30 逐条裁定 D003/D005/D006/D007
- D003 → (b) 混合路线：算法核 HLS + 像素时钟/读侧时序/跨时钟/AXI 拓扑手写 RTL，
  同一 BD 由 bd_*.tcl 出片。把既成事实登记为裁定，代码不动。
- D005 → (a) 内部使用声明：data/README.md 新增「来源与用途」（公开转播片段、
  仅课程作业内部评测、不随包分发、不授予第三方）；用户同日确认有权使用。
  报告 §7.1 补同一口径。
- D006 → 冻结 v1：地址表/4bpp 打包口径/WPR=100/按键引脚，改地址或格式必须新开
  decision。docs/accel_interface.md 与 docs/flow_overlay.md §3 加冻结声明。
- D007 → 只复用引脚/电气资料（比草案更严）：旧项目现象结论不再作为依据，
  ref/pitfalls_from_oi.md 加降级声明，docs/yolo_on_zynq7020_survey.md 里
  「可复用旧项目摄像头/LCD/OSD 管线」的说法按裁定改掉，skill/ 两包注明只提炼
  本仓库自己的会话。

台账原地改状态 + 补裁定原文 + 变更记录；汇总从 20/4 改为 24/0（只剩 D004 参数）；
README / repo_spec §7 / architecture / src README / report README / 草案文件同步。

Co-Authored-By: Claude Code <noreply@anthropic.com>
</commit_message>
<xml_diff>
--- a/report/design_report.docx
+++ b/report/design_report.docx
@@ -9939,6 +9939,244 @@
     <w:p/>
     <w:p>
       <w:pPr>
+        <w:ind w:left="360"/>
+      </w:pPr>
+      <w:r>
+        <w:rPr>
+          <w:rFonts w:ascii="微软雅黑" w:hAnsi="微软雅黑" w:eastAsia="微软雅黑"/>
+          <w:b/>
+          <w:i/>
+          <w:color w:val="556577"/>
+          <w:sz w:val="19"/>
+        </w:rPr>
+        <w:t>实现方式的边界（D003，用户 2026-10-30 裁定 = 混合路线）</w:t>
+      </w:r>
+      <w:r>
+        <w:rPr>
+          <w:rFonts w:ascii="微软雅黑" w:hAnsi="微软雅黑" w:eastAsia="微软雅黑"/>
+          <w:b w:val="0"/>
+          <w:i/>
+          <w:color w:val="556577"/>
+          <w:sz w:val="19"/>
+        </w:rPr>
+        <w:t>：上表「PL」一列里的像素级算法核 （</w:t>
+      </w:r>
+      <w:r>
+        <w:rPr>
+          <w:rFonts w:ascii="Consolas" w:hAnsi="Consolas" w:eastAsia="Consolas"/>
+          <w:i/>
+          <w:color w:val="556577"/>
+          <w:sz w:val="18"/>
+        </w:rPr>
+        <w:t>preproc</w:t>
+      </w:r>
+      <w:r>
+        <w:rPr>
+          <w:rFonts w:ascii="微软雅黑" w:hAnsi="微软雅黑" w:eastAsia="微软雅黑"/>
+          <w:b w:val="0"/>
+          <w:i/>
+          <w:color w:val="556577"/>
+          <w:sz w:val="19"/>
+        </w:rPr>
+        <w:t xml:space="preserve"> / </w:t>
+      </w:r>
+      <w:r>
+        <w:rPr>
+          <w:rFonts w:ascii="Consolas" w:hAnsi="Consolas" w:eastAsia="Consolas"/>
+          <w:i/>
+          <w:color w:val="556577"/>
+          <w:sz w:val="18"/>
+        </w:rPr>
+        <w:t>mask_preproc</w:t>
+      </w:r>
+      <w:r>
+        <w:rPr>
+          <w:rFonts w:ascii="微软雅黑" w:hAnsi="微软雅黑" w:eastAsia="微软雅黑"/>
+          <w:b w:val="0"/>
+          <w:i/>
+          <w:color w:val="556577"/>
+          <w:sz w:val="19"/>
+        </w:rPr>
+        <w:t xml:space="preserve"> / </w:t>
+      </w:r>
+      <w:r>
+        <w:rPr>
+          <w:rFonts w:ascii="Consolas" w:hAnsi="Consolas" w:eastAsia="Consolas"/>
+          <w:i/>
+          <w:color w:val="556577"/>
+          <w:sz w:val="18"/>
+        </w:rPr>
+        <w:t>track_preproc</w:t>
+      </w:r>
+      <w:r>
+        <w:rPr>
+          <w:rFonts w:ascii="微软雅黑" w:hAnsi="微软雅黑" w:eastAsia="微软雅黑"/>
+          <w:b w:val="0"/>
+          <w:i/>
+          <w:color w:val="556577"/>
+          <w:sz w:val="19"/>
+        </w:rPr>
+        <w:t xml:space="preserve"> / </w:t>
+      </w:r>
+      <w:r>
+        <w:rPr>
+          <w:rFonts w:ascii="Consolas" w:hAnsi="Consolas" w:eastAsia="Consolas"/>
+          <w:i/>
+          <w:color w:val="556577"/>
+          <w:sz w:val="18"/>
+        </w:rPr>
+        <w:t>conv_engine</w:t>
+      </w:r>
+      <w:r>
+        <w:rPr>
+          <w:rFonts w:ascii="微软雅黑" w:hAnsi="微软雅黑" w:eastAsia="微软雅黑"/>
+          <w:b w:val="0"/>
+          <w:i/>
+          <w:color w:val="556577"/>
+          <w:sz w:val="19"/>
+        </w:rPr>
+        <w:t xml:space="preserve"> / </w:t>
+      </w:r>
+      <w:r>
+        <w:rPr>
+          <w:rFonts w:ascii="Consolas" w:hAnsi="Consolas" w:eastAsia="Consolas"/>
+          <w:i/>
+          <w:color w:val="556577"/>
+          <w:sz w:val="18"/>
+        </w:rPr>
+        <w:t>bw</w:t>
+      </w:r>
+      <w:r>
+        <w:rPr>
+          <w:rFonts w:ascii="微软雅黑" w:hAnsi="微软雅黑" w:eastAsia="微软雅黑"/>
+          <w:b w:val="0"/>
+          <w:i/>
+          <w:color w:val="556577"/>
+          <w:sz w:val="19"/>
+        </w:rPr>
+        <w:t>）</w:t>
+      </w:r>
+      <w:r>
+        <w:rPr>
+          <w:rFonts w:ascii="微软雅黑" w:hAnsi="微软雅黑" w:eastAsia="微软雅黑"/>
+          <w:b/>
+          <w:i/>
+          <w:color w:val="556577"/>
+          <w:sz w:val="19"/>
+        </w:rPr>
+        <w:t>全部用 Vitis HLS 2020.2 生成</w:t>
+      </w:r>
+      <w:r>
+        <w:rPr>
+          <w:rFonts w:ascii="微软雅黑" w:hAnsi="微软雅黑" w:eastAsia="微软雅黑"/>
+          <w:b w:val="0"/>
+          <w:i/>
+          <w:color w:val="556577"/>
+          <w:sz w:val="19"/>
+        </w:rPr>
+        <w:t>； 像素时钟、读侧时序、跨时钟域与 AXI 拓扑</w:t>
+      </w:r>
+      <w:r>
+        <w:rPr>
+          <w:rFonts w:ascii="微软雅黑" w:hAnsi="微软雅黑" w:eastAsia="微软雅黑"/>
+          <w:b/>
+          <w:i/>
+          <w:color w:val="556577"/>
+          <w:sz w:val="19"/>
+        </w:rPr>
+        <w:t>用手写 RTL</w:t>
+      </w:r>
+      <w:r>
+        <w:rPr>
+          <w:rFonts w:ascii="微软雅黑" w:hAnsi="微软雅黑" w:eastAsia="微软雅黑"/>
+          <w:b w:val="0"/>
+          <w:i/>
+          <w:color w:val="556577"/>
+          <w:sz w:val="19"/>
+        </w:rPr>
+        <w:t xml:space="preserve">（HLS 不适合做逐拍时序与像素时钟）。 两者在同一个 BD 内由 </w:t>
+      </w:r>
+      <w:r>
+        <w:rPr>
+          <w:rFonts w:ascii="Consolas" w:hAnsi="Consolas" w:eastAsia="Consolas"/>
+          <w:i/>
+          <w:color w:val="556577"/>
+          <w:sz w:val="18"/>
+        </w:rPr>
+        <w:t>build/scripts/bd_*.tcl</w:t>
+      </w:r>
+      <w:r>
+        <w:rPr>
+          <w:rFonts w:ascii="微软雅黑" w:hAnsi="微软雅黑" w:eastAsia="微软雅黑"/>
+          <w:b w:val="0"/>
+          <w:i/>
+          <w:color w:val="556577"/>
+          <w:sz w:val="19"/>
+        </w:rPr>
+        <w:t xml:space="preserve"> 统一出片 —— 这是一条</w:t>
+      </w:r>
+      <w:r>
+        <w:rPr>
+          <w:rFonts w:ascii="微软雅黑" w:hAnsi="微软雅黑" w:eastAsia="微软雅黑"/>
+          <w:b/>
+          <w:i/>
+          <w:color w:val="556577"/>
+          <w:sz w:val="19"/>
+        </w:rPr>
+        <w:t>裁定</w:t>
+      </w:r>
+      <w:r>
+        <w:rPr>
+          <w:rFonts w:ascii="微软雅黑" w:hAnsi="微软雅黑" w:eastAsia="微软雅黑"/>
+          <w:b w:val="0"/>
+          <w:i/>
+          <w:color w:val="556577"/>
+          <w:sz w:val="19"/>
+        </w:rPr>
+        <w:t>，不是实现偏好。 接口数值侧另有一条裁定（D006）：地址表、4bpp 打包口径、</w:t>
+      </w:r>
+      <w:r>
+        <w:rPr>
+          <w:rFonts w:ascii="Consolas" w:hAnsi="Consolas" w:eastAsia="Consolas"/>
+          <w:i/>
+          <w:color w:val="556577"/>
+          <w:sz w:val="18"/>
+        </w:rPr>
+        <w:t>WPR=100</w:t>
+      </w:r>
+      <w:r>
+        <w:rPr>
+          <w:rFonts w:ascii="微软雅黑" w:hAnsi="微软雅黑" w:eastAsia="微软雅黑"/>
+          <w:b w:val="0"/>
+          <w:i/>
+          <w:color w:val="556577"/>
+          <w:sz w:val="19"/>
+        </w:rPr>
+        <w:t>、按键引脚</w:t>
+      </w:r>
+      <w:r>
+        <w:rPr>
+          <w:rFonts w:ascii="微软雅黑" w:hAnsi="微软雅黑" w:eastAsia="微软雅黑"/>
+          <w:b/>
+          <w:i/>
+          <w:color w:val="556577"/>
+          <w:sz w:val="19"/>
+        </w:rPr>
+        <w:t>已冻结为 v1</w:t>
+      </w:r>
+      <w:r>
+        <w:rPr>
+          <w:rFonts w:ascii="微软雅黑" w:hAnsi="微软雅黑" w:eastAsia="微软雅黑"/>
+          <w:b w:val="0"/>
+          <w:i/>
+          <w:color w:val="556577"/>
+          <w:sz w:val="19"/>
+        </w:rPr>
+        <w:t>， 改地址或改格式必须新开一条 decision，不许在代码里悄悄改。</w:t>
+      </w:r>
+    </w:p>
+    <w:p>
+      <w:pPr>
         <w:spacing w:after="120"/>
         <w:ind w:firstLine="0"/>
       </w:pPr>
@@ -17684,6 +17922,168 @@
           <w:sz w:val="19"/>
         </w:rPr>
         <w:t xml:space="preserve"> 的脚本 + SHA256 重建。</w:t>
+      </w:r>
+    </w:p>
+    <w:p>
+      <w:pPr>
+        <w:ind w:left="360"/>
+      </w:pPr>
+      <w:r>
+        <w:rPr>
+          <w:rFonts w:ascii="微软雅黑" w:hAnsi="微软雅黑" w:eastAsia="微软雅黑"/>
+          <w:b/>
+          <w:i/>
+          <w:color w:val="556577"/>
+          <w:sz w:val="19"/>
+        </w:rPr>
+        <w:t>数据来源与用途（D005，用户 2026-10-30 裁定 = 内部使用声明）</w:t>
+      </w:r>
+      <w:r>
+        <w:rPr>
+          <w:rFonts w:ascii="微软雅黑" w:hAnsi="微软雅黑" w:eastAsia="微软雅黑"/>
+          <w:b w:val="0"/>
+          <w:i/>
+          <w:color w:val="556577"/>
+          <w:sz w:val="19"/>
+        </w:rPr>
+        <w:t>：本报告里的比赛视频片段 （</w:t>
+      </w:r>
+      <w:r>
+        <w:rPr>
+          <w:rFonts w:ascii="Consolas" w:hAnsi="Consolas" w:eastAsia="Consolas"/>
+          <w:i/>
+          <w:color w:val="556577"/>
+          <w:sz w:val="18"/>
+        </w:rPr>
+        <w:t>data/samples/incidents/</w:t>
+      </w:r>
+      <w:r>
+        <w:rPr>
+          <w:rFonts w:ascii="微软雅黑" w:hAnsi="微软雅黑" w:eastAsia="微软雅黑"/>
+          <w:b w:val="0"/>
+          <w:i/>
+          <w:color w:val="556577"/>
+          <w:sz w:val="19"/>
+        </w:rPr>
+        <w:t xml:space="preserve"> 12 段、</w:t>
+      </w:r>
+      <w:r>
+        <w:rPr>
+          <w:rFonts w:ascii="Consolas" w:hAnsi="Consolas" w:eastAsia="Consolas"/>
+          <w:i/>
+          <w:color w:val="556577"/>
+          <w:sz w:val="18"/>
+        </w:rPr>
+        <w:t>data/samples/scenes/</w:t>
+      </w:r>
+      <w:r>
+        <w:rPr>
+          <w:rFonts w:ascii="微软雅黑" w:hAnsi="微软雅黑" w:eastAsia="微软雅黑"/>
+          <w:b w:val="0"/>
+          <w:i/>
+          <w:color w:val="556577"/>
+          <w:sz w:val="19"/>
+        </w:rPr>
+        <w:t xml:space="preserve"> 16 段分层片段）来自</w:t>
+      </w:r>
+      <w:r>
+        <w:rPr>
+          <w:rFonts w:ascii="微软雅黑" w:hAnsi="微软雅黑" w:eastAsia="微软雅黑"/>
+          <w:b/>
+          <w:i/>
+          <w:color w:val="556577"/>
+          <w:sz w:val="19"/>
+        </w:rPr>
+        <w:t>公开赛事转播</w:t>
+      </w:r>
+      <w:r>
+        <w:rPr>
+          <w:rFonts w:ascii="微软雅黑" w:hAnsi="微软雅黑" w:eastAsia="微软雅黑"/>
+          <w:b w:val="0"/>
+          <w:i/>
+          <w:color w:val="556577"/>
+          <w:sz w:val="19"/>
+        </w:rPr>
+        <w:t xml:space="preserve">， </w:t>
+      </w:r>
+      <w:r>
+        <w:rPr>
+          <w:rFonts w:ascii="微软雅黑" w:hAnsi="微软雅黑" w:eastAsia="微软雅黑"/>
+          <w:b/>
+          <w:i/>
+          <w:color w:val="556577"/>
+          <w:sz w:val="19"/>
+        </w:rPr>
+        <w:t>仅用于本课程作业的内部评测与复现</w:t>
+      </w:r>
+      <w:r>
+        <w:rPr>
+          <w:rFonts w:ascii="微软雅黑" w:hAnsi="微软雅黑" w:eastAsia="微软雅黑"/>
+          <w:b w:val="0"/>
+          <w:i/>
+          <w:color w:val="556577"/>
+          <w:sz w:val="19"/>
+        </w:rPr>
+        <w:t>；</w:t>
+      </w:r>
+      <w:r>
+        <w:rPr>
+          <w:rFonts w:ascii="微软雅黑" w:hAnsi="微软雅黑" w:eastAsia="微软雅黑"/>
+          <w:b/>
+          <w:i/>
+          <w:color w:val="556577"/>
+          <w:sz w:val="19"/>
+        </w:rPr>
+        <w:t>不随提交包分发</w:t>
+      </w:r>
+      <w:r>
+        <w:rPr>
+          <w:rFonts w:ascii="微软雅黑" w:hAnsi="微软雅黑" w:eastAsia="微软雅黑"/>
+          <w:b w:val="0"/>
+          <w:i/>
+          <w:color w:val="556577"/>
+          <w:sz w:val="19"/>
+        </w:rPr>
+        <w:t>（</w:t>
+      </w:r>
+      <w:r>
+        <w:rPr>
+          <w:rFonts w:ascii="Consolas" w:hAnsi="Consolas" w:eastAsia="Consolas"/>
+          <w:i/>
+          <w:color w:val="556577"/>
+          <w:sz w:val="18"/>
+        </w:rPr>
+        <w:t>tools/make_submission.py</w:t>
+      </w:r>
+      <w:r>
+        <w:rPr>
+          <w:rFonts w:ascii="微软雅黑" w:hAnsi="微软雅黑" w:eastAsia="微软雅黑"/>
+          <w:b w:val="0"/>
+          <w:i/>
+          <w:color w:val="556577"/>
+          <w:sz w:val="19"/>
+        </w:rPr>
+        <w:t xml:space="preserve"> 只带运行必需件）， 本仓库也</w:t>
+      </w:r>
+      <w:r>
+        <w:rPr>
+          <w:rFonts w:ascii="微软雅黑" w:hAnsi="微软雅黑" w:eastAsia="微软雅黑"/>
+          <w:b/>
+          <w:i/>
+          <w:color w:val="556577"/>
+          <w:sz w:val="19"/>
+        </w:rPr>
+        <w:t>不授予任何第三方</w:t>
+      </w:r>
+      <w:r>
+        <w:rPr>
+          <w:rFonts w:ascii="微软雅黑" w:hAnsi="微软雅黑" w:eastAsia="微软雅黑"/>
+          <w:b w:val="0"/>
+          <w:i/>
+          <w:color w:val="556577"/>
+          <w:sz w:val="19"/>
+        </w:rPr>
+        <w:t>对它们的使用权。用户同日确认：本人有权在作业范围内使用这些片段。 若项目后续对外发布，须按 D005 的 (b) 分支换成许可明确的数据集并重做标定与相关指标。</w:t>
       </w:r>
     </w:p>
     <w:p>

</xml_diff>

<commit_message>
feat(hdmi): HDMI_VISUAL_OK —— 13:37 片六屏人眼「全对」，固化 overlay first pass
13:50 部署 13:37 的 flow_system.bit（sha256 ad628200…104a），六屏累加和全部 MATCH：
EDGES 8DA6F4C0 / HBANDS FFF8F800 / VBANDS FFF8F800 / GRID D2FD2F00 / MARKERS 1FDF3E00，
under=0。人眼当场确认「全对」：左边缘纯白、右边缘纯红、绿方块居中；8 横带/8 竖带
顺序厚度正确、无黑横条、不跳；45 横 + 80 竖线一条不少；运动方块无撕裂。

机器侧旁证：列码 Σ/行 = 818,560（0+1+…+1279 一位不差）、每个源列与源行都恰好
显示 1 次（含 1278/1279、719）。

更正一条方法论错误：上一版 VBANDS/GRID/MARKERS 报 MISMATCH 不是硬件错，
是期望值按旧口径（xpos-2）算的。累加和对位移是瞎的 —— 它只知道某列被显示了几次，
不知道显示在哪一列，这类位置判据只能人眼量，EDGES 屏就是为此加的。

证据：data/results/hdmi_visual_ok.json（绑定 bit sha256，写明本结论不覆盖什么）。
报告升 v1.3 并重出 docx；提交包重出为 dist/zynq-yolo_submission_20261031_1358.zip
（668 文件 / 104.6 MB，CHECK_REPO_OK 6 PASS / 0 FAIL），已删当日旧包。

Co-Authored-By: Claude Code <noreply@anthropic.com>
</commit_message>
<xml_diff>
--- a/report/design_report.docx
+++ b/report/design_report.docx
@@ -1066,53 +1066,46 @@
                 <w:b/>
                 <w:sz w:val="18"/>
               </w:rPr>
-              <w:t>人眼部分过（2026-10-31 12:52 片）</w:t>
-            </w:r>
-            <w:r>
-              <w:rPr>
-                <w:rFonts w:ascii="微软雅黑" w:hAnsi="微软雅黑" w:eastAsia="微软雅黑"/>
-                <w:b w:val="0"/>
-                <w:sz w:val="18"/>
-              </w:rPr>
-              <w:t xml:space="preserve">：13 条黑横条消失、画面不再跳动（取数吞吐已修）；剩余整幅图右移 2 像素（读地址 </w:t>
+              <w:t>人眼已过</w:t>
+            </w:r>
+            <w:r>
+              <w:rPr>
+                <w:rFonts w:ascii="微软雅黑" w:hAnsi="微软雅黑" w:eastAsia="微软雅黑"/>
+                <w:b w:val="0"/>
+                <w:sz w:val="18"/>
+              </w:rPr>
+              <w:t xml:space="preserve">（2026-10-31 13:56，13:37 片，用户当场确认「全对」）：EDGES 屏左边缘纯白、右边缘纯红、绿方块居中；8 横带/8 竖带顺序厚度正确、无黑横条、画面不跳；45 横 + 80 竖线一条不少；运动方块无撕裂 ⇒ </w:t>
+            </w:r>
+            <w:r>
+              <w:rPr>
+                <w:rFonts w:ascii="微软雅黑" w:hAnsi="微软雅黑" w:eastAsia="微软雅黑"/>
+                <w:b/>
+                <w:sz w:val="18"/>
+              </w:rPr>
+              <w:t>`HDMI_VISUAL_OK`</w:t>
+            </w:r>
+            <w:r>
+              <w:rPr>
+                <w:rFonts w:ascii="微软雅黑" w:hAnsi="微软雅黑" w:eastAsia="微软雅黑"/>
+                <w:b w:val="0"/>
+                <w:sz w:val="18"/>
+              </w:rPr>
+              <w:t xml:space="preserve">（证据 </w:t>
             </w:r>
             <w:r>
               <w:rPr>
                 <w:rFonts w:ascii="Consolas" w:hAnsi="Consolas" w:eastAsia="Consolas"/>
                 <w:sz w:val="17"/>
               </w:rPr>
-              <w:t>max(xpos-2,0)</w:t>
-            </w:r>
-            <w:r>
-              <w:rPr>
-                <w:rFonts w:ascii="微软雅黑" w:hAnsi="微软雅黑" w:eastAsia="微软雅黑"/>
-                <w:b w:val="0"/>
-                <w:sz w:val="18"/>
-              </w:rPr>
-              <w:t xml:space="preserve"> 造成，已改回 </w:t>
-            </w:r>
-            <w:r>
-              <w:rPr>
-                <w:rFonts w:ascii="Consolas" w:hAnsi="Consolas" w:eastAsia="Consolas"/>
-                <w:sz w:val="17"/>
-              </w:rPr>
-              <w:t>xpos</w:t>
-            </w:r>
-            <w:r>
-              <w:rPr>
-                <w:rFonts w:ascii="微软雅黑" w:hAnsi="微软雅黑" w:eastAsia="微软雅黑"/>
-                <w:b w:val="0"/>
-                <w:sz w:val="18"/>
-              </w:rPr>
-              <w:t>），</w:t>
-            </w:r>
-            <w:r>
-              <w:rPr>
-                <w:rFonts w:ascii="微软雅黑" w:hAnsi="微软雅黑" w:eastAsia="微软雅黑"/>
-                <w:b/>
-                <w:sz w:val="18"/>
-              </w:rPr>
-              <w:t>13:37 的片因网口断开尚未上板</w:t>
+              <w:t>data/results/hdmi_visual_ok.json</w:t>
+            </w:r>
+            <w:r>
+              <w:rPr>
+                <w:rFonts w:ascii="微软雅黑" w:hAnsi="微软雅黑" w:eastAsia="微软雅黑"/>
+                <w:b w:val="0"/>
+                <w:sz w:val="18"/>
+              </w:rPr>
+              <w:t>，绑定 sha256）</w:t>
             </w:r>
           </w:p>
         </w:tc>
@@ -8235,7 +8228,7 @@
                 <w:b/>
                 <w:sz w:val="18"/>
               </w:rPr>
-              <w:t>待上板（10-31 13:37 片）</w:t>
+              <w:t>上板（10-31 13:50 片，机器+人眼）</w:t>
             </w:r>
           </w:p>
         </w:tc>
@@ -8251,53 +8244,61 @@
                 <w:b w:val="0"/>
                 <w:sz w:val="18"/>
               </w:rPr>
-              <w:t>已出片、未验证</w:t>
-            </w:r>
-          </w:p>
-        </w:tc>
-        <w:tc>
-          <w:tcPr>
-            <w:tcW w:type="dxa" w:w="2880"/>
-          </w:tcPr>
-          <w:p>
-            <w:r/>
-            <w:r>
-              <w:rPr>
-                <w:rFonts w:ascii="微软雅黑" w:hAnsi="微软雅黑" w:eastAsia="微软雅黑"/>
-                <w:b w:val="0"/>
-                <w:sz w:val="18"/>
-              </w:rPr>
-              <w:t xml:space="preserve">WNS 4.184 ns / WHS 0.036，0 失败端点；全量 </w:t>
+              <w:t xml:space="preserve">✅ </w:t>
             </w:r>
             <w:r>
               <w:rPr>
                 <w:rFonts w:ascii="Consolas" w:hAnsi="Consolas" w:eastAsia="Consolas"/>
                 <w:sz w:val="17"/>
               </w:rPr>
-              <w:t>SIM_PASS 12/12</w:t>
-            </w:r>
-            <w:r>
-              <w:rPr>
-                <w:rFonts w:ascii="微软雅黑" w:hAnsi="微软雅黑" w:eastAsia="微软雅黑"/>
-                <w:b w:val="0"/>
-                <w:sz w:val="18"/>
-              </w:rPr>
-              <w:t>。部署前本机网口断开（</w:t>
+              <w:t>HDMI_VISUAL_OK</w:t>
+            </w:r>
+          </w:p>
+        </w:tc>
+        <w:tc>
+          <w:tcPr>
+            <w:tcW w:type="dxa" w:w="2880"/>
+          </w:tcPr>
+          <w:p>
+            <w:r/>
+            <w:r>
+              <w:rPr>
+                <w:rFonts w:ascii="微软雅黑" w:hAnsi="微软雅黑" w:eastAsia="微软雅黑"/>
+                <w:b w:val="0"/>
+                <w:sz w:val="18"/>
+              </w:rPr>
+              <w:t>13:37 片部署后六屏累加和</w:t>
+            </w:r>
+            <w:r>
+              <w:rPr>
+                <w:rFonts w:ascii="微软雅黑" w:hAnsi="微软雅黑" w:eastAsia="微软雅黑"/>
+                <w:b/>
+                <w:sz w:val="18"/>
+              </w:rPr>
+              <w:t>全部 MATCH</w:t>
+            </w:r>
+            <w:r>
+              <w:rPr>
+                <w:rFonts w:ascii="微软雅黑" w:hAnsi="微软雅黑" w:eastAsia="微软雅黑"/>
+                <w:b w:val="0"/>
+                <w:sz w:val="18"/>
+              </w:rPr>
+              <w:t>（EDGES/HBANDS/VBANDS/GRID/MARKERS），</w:t>
             </w:r>
             <w:r>
               <w:rPr>
                 <w:rFonts w:ascii="Consolas" w:hAnsi="Consolas" w:eastAsia="Consolas"/>
                 <w:sz w:val="17"/>
               </w:rPr>
-              <w:t>以太网</w:t>
-            </w:r>
-            <w:r>
-              <w:rPr>
-                <w:rFonts w:ascii="微软雅黑" w:hAnsi="微软雅黑" w:eastAsia="微软雅黑"/>
-                <w:b w:val="0"/>
-                <w:sz w:val="18"/>
-              </w:rPr>
-              <w:t xml:space="preserve"> 媒态断开），</w:t>
+              <w:t>under=0</w:t>
+            </w:r>
+            <w:r>
+              <w:rPr>
+                <w:rFonts w:ascii="微软雅黑" w:hAnsi="微软雅黑" w:eastAsia="微软雅黑"/>
+                <w:b w:val="0"/>
+                <w:sz w:val="18"/>
+              </w:rPr>
+              <w:t xml:space="preserve">；列码 Σ/行 = </w:t>
             </w:r>
             <w:r>
               <w:rPr>
@@ -8305,45 +8306,47 @@
                 <w:b/>
                 <w:sz w:val="18"/>
               </w:rPr>
-              <w:t>这一版没上过板</w:t>
-            </w:r>
-            <w:r>
-              <w:rPr>
-                <w:rFonts w:ascii="微软雅黑" w:hAnsi="微软雅黑" w:eastAsia="微软雅黑"/>
-                <w:b w:val="0"/>
-                <w:sz w:val="18"/>
-              </w:rPr>
-              <w:t xml:space="preserve"> ⇒ </w:t>
-            </w:r>
-            <w:r>
-              <w:rPr>
-                <w:rFonts w:ascii="Consolas" w:hAnsi="Consolas" w:eastAsia="Consolas"/>
-                <w:sz w:val="17"/>
-              </w:rPr>
-              <w:t>HDMI_VISUAL_OK</w:t>
-            </w:r>
-            <w:r>
-              <w:rPr>
-                <w:rFonts w:ascii="微软雅黑" w:hAnsi="微软雅黑" w:eastAsia="微软雅黑"/>
-                <w:b w:val="0"/>
-                <w:sz w:val="18"/>
-              </w:rPr>
-              <w:t xml:space="preserve"> 仍不记。下次上板第一屏看 </w:t>
-            </w:r>
-            <w:r>
-              <w:rPr>
-                <w:rFonts w:ascii="Consolas" w:hAnsi="Consolas" w:eastAsia="Consolas"/>
-                <w:sz w:val="17"/>
-              </w:rPr>
-              <w:t>EDGES</w:t>
-            </w:r>
-            <w:r>
-              <w:rPr>
-                <w:rFonts w:ascii="微软雅黑" w:hAnsi="微软雅黑" w:eastAsia="微软雅黑"/>
-                <w:b w:val="0"/>
-                <w:sz w:val="18"/>
-              </w:rPr>
-              <w:t>（源列 0..3 白 / 1276..1279 红，左应纯白、右应纯红）</w:t>
+              <w:t>818,560</w:t>
+            </w:r>
+            <w:r>
+              <w:rPr>
+                <w:rFonts w:ascii="微软雅黑" w:hAnsi="微软雅黑" w:eastAsia="微软雅黑"/>
+                <w:b w:val="0"/>
+                <w:sz w:val="18"/>
+              </w:rPr>
+              <w:t>、</w:t>
+            </w:r>
+            <w:r>
+              <w:rPr>
+                <w:rFonts w:ascii="微软雅黑" w:hAnsi="微软雅黑" w:eastAsia="微软雅黑"/>
+                <w:b/>
+                <w:sz w:val="18"/>
+              </w:rPr>
+              <w:t>每个源列与源行都恰好显示 1 次</w:t>
+            </w:r>
+            <w:r>
+              <w:rPr>
+                <w:rFonts w:ascii="微软雅黑" w:hAnsi="微软雅黑" w:eastAsia="微软雅黑"/>
+                <w:b w:val="0"/>
+                <w:sz w:val="18"/>
+              </w:rPr>
+              <w:t xml:space="preserve">。人眼当场确认「全对」。另更正一条：上一版三屏 MISMATCH </w:t>
+            </w:r>
+            <w:r>
+              <w:rPr>
+                <w:rFonts w:ascii="微软雅黑" w:hAnsi="微软雅黑" w:eastAsia="微软雅黑"/>
+                <w:b/>
+                <w:sz w:val="18"/>
+              </w:rPr>
+              <w:t>是期望值按旧口径算错，不是硬件错</w:t>
+            </w:r>
+            <w:r>
+              <w:rPr>
+                <w:rFonts w:ascii="微软雅黑" w:hAnsi="微软雅黑" w:eastAsia="微软雅黑"/>
+                <w:b w:val="0"/>
+                <w:sz w:val="18"/>
+              </w:rPr>
+              <w:t xml:space="preserve"> —— 累加和对位移是瞎的，位置只能人眼量</w:t>
             </w:r>
           </w:p>
         </w:tc>

</xml_diff>